<commit_message>
Thuyết minh chi tiết (từng hiện vật): darwin-museum, izmailovo-kremlin, garage-museum [nhóm B]
Co-Authored-By: Claude Opus 4.8 <noreply@anthropic.com>
Claude-Session: https://claude.ai/code/session_01RsbExP4ywnVWAdR4wTXyvX
</commit_message>
<xml_diff>
--- a/tai-lieu-noi-bo/moscow/darwin-museum.docx
+++ b/tai-lieu-noi-bo/moscow/darwin-museum.docx
@@ -37,7 +37,7 @@
         <w:rPr>
           <w:sz w:val="25"/>
         </w:rPr>
-        <w:t>Bảo tàng tiến hoá đầu tiên trên thế giới giữa lòng Moskva — nơi khoảng 400.000 hiện vật, từ bộ xương chim dodo tới những con thú bạch tạng hiếm hoi, kể lại 4,5 tỷ năm hành trình của sự sống mà vợ chồng nhà khoa học Kots đã gây dựng bằng cả đam mê lẫn tiền ăn sáng.</w:t>
+        <w:t>Bảo tàng tiến hoá đầu tiên trên thế giới giữa lòng Moskva — nơi khoảng 400.000 hiện vật, từ con thỏ đen «ký hiệu số 1» và bộ xương chim dodo tới con voi châu Phi của Nga hoàng, kể lại 4,5 tỷ năm hành trình của sự sống mà vợ chồng nhà khoa học Kots đã gây dựng bằng cả đam mê lẫn tiền ăn sáng.</w:t>
       </w:r>
     </w:p>
     <w:p>
@@ -63,7 +63,7 @@
         <w:pStyle w:val="ListBullet"/>
       </w:pPr>
       <w:r>
-        <w:t>Bộ sưu tập khoảng 400.000 hiện vật — thuộc hàng bảo tàng lịch sử tự nhiên lớn nhất châu Âu.</w:t>
+        <w:t>Hiện vật «ký hiệu số 1» chính là một con thỏ rừng lông đen (hắc tố) mà Kots mua ngày 28/2/1907 với giá 15 rúp — gấp năm lần giá thường — ở chợ Okhotny Ryad.</w:t>
       </w:r>
     </w:p>
     <w:p>
@@ -71,7 +71,7 @@
         <w:pStyle w:val="ListBullet"/>
       </w:pPr>
       <w:r>
-        <w:t>Bộ sưu tập biến dị màu sắc lớn nhất thế giới: khoảng 800 con thú hiếm và 34 cá thể bạch tạng thuần.</w:t>
+        <w:t>Bộ sưu tập biến dị màu sắc (bạch tạng và hắc tố) vào loại lớn nhất — theo chính bảo tàng là lớn nhất nước Nga: hơn 600 con gà gô dị sắc, gần 330 con cáo, công trắng, linh miêu trắng, sói trắng và đen…</w:t>
       </w:r>
     </w:p>
     <w:p>
@@ -79,7 +79,7 @@
         <w:pStyle w:val="ListBullet"/>
       </w:pPr>
       <w:r>
-        <w:t>Những báu vật tuyệt chủng: bộ xương chim dodo, tiêu bản chim anca lớn không cánh và bồ câu viễn khách.</w:t>
+        <w:t>Khoảng 400.000 hiện vật trên ba tầng trưng bày, hơn nửa triệu lượt khách mỗi năm — thuộc hàng bảo tàng lịch sử tự nhiên lớn nhất châu Âu.</w:t>
       </w:r>
     </w:p>
     <w:p>
@@ -87,7 +87,7 @@
         <w:pStyle w:val="ListBullet"/>
       </w:pPr>
       <w:r>
-        <w:t>Màn trình diễn ánh sáng – âm thanh «Hành tinh Sống» tái hiện 4,5 tỷ năm tiến hoá của sự sống.</w:t>
+        <w:t>Bộ xương chim dodo — bộ (gần) hoàn chỉnh duy nhất ở Nga, đi vòng thế giới từ đảo Mauritius qua Paris rồi về Moskva.</w:t>
       </w:r>
     </w:p>
     <w:p>
@@ -95,7 +95,23 @@
         <w:pStyle w:val="ListBullet"/>
       </w:pPr>
       <w:r>
-        <w:t>Di sản kép của vợ chồng Kots: Aleksandr với bảo tàng học, và Nadezhda Ladygina-Kots với tâm lý học linh trưởng tiên phong.</w:t>
+        <w:t>Con voi châu Phi của Nga hoàng Nikolai II — bộ da nằm trong thùng muối cả chục năm trước khi nghệ nhân Filipp Fedulov nhồi thành công năm 1927.</w:t>
+      </w:r>
+    </w:p>
+    <w:p>
+      <w:pPr>
+        <w:pStyle w:val="ListBullet"/>
+      </w:pPr>
+      <w:r>
+        <w:t>Màn trình diễn ánh sáng – âm thanh «Hành tinh Sống» (Живая планета) tái hiện 4,5 tỷ năm sự sống, ngay trong gian «Đa dạng sự sống».</w:t>
+      </w:r>
+    </w:p>
+    <w:p>
+      <w:pPr>
+        <w:pStyle w:val="ListBullet"/>
+      </w:pPr>
+      <w:r>
+        <w:t>Di sản kép của vợ chồng Kots: Aleksandr với bảo tàng học, và Nadezhda Ladygina-Kots với chú tinh tinh Joni — tâm lý học linh trưởng tiên phong.</w:t>
       </w:r>
     </w:p>
     <w:p>
@@ -114,7 +130,7 @@
         <w:jc w:val="both"/>
       </w:pPr>
       <w:r>
-        <w:t>Nằm ở phía tây nam Moskva (Mát-xcơ-va), trên con phố Vavilova (Va-vi-lô-va) yên tĩnh thuộc quận Akademichesky, Bảo tàng Darwin Quốc gia (Государственный Дарвиновский музей) là một trong những địa chỉ khoa học đặc biệt nhất nước Nga. Đây không phải là một bảo tàng lịch sử tự nhiên thông thường chỉ trưng bày mẫu vật cho đẹp mắt, mà được dựng lên để kể một câu chuyện lớn: câu chuyện về sự tiến hoá của muôn loài theo học thuyết của Charles Darwin (Sác-lơ Đác-uyn). Mỗi hiện vật ở đây, từ bộ xương khủng long đồ sộ đến con chim nhồi bông nhỏ xíu, đều là một mắt xích trong lập luận về nguồn gốc và sự biến đổi của sự sống.</w:t>
+        <w:t>Nằm ở phía tây nam Moskva (Mát-xcơ-va), trên con phố Vavilova (Va-vi-lô-va) yên tĩnh thuộc quận Akademichesky, Bảo tàng Darwin Quốc gia (Государственный Дарвиновский музей) là một trong những địa chỉ khoa học đặc biệt nhất nước Nga. Đây không phải là một bảo tàng lịch sử tự nhiên thông thường chỉ trưng bày mẫu vật cho đẹp mắt, mà được dựng lên để kể một câu chuyện lớn: câu chuyện về sự tiến hoá của muôn loài theo học thuyết của Charles Darwin (Sác-lơ Đác-uyn). Mỗi hiện vật ở đây, từ bộ xương đồ sộ đến con chim nhồi bông nhỏ xíu, đều là một mắt xích trong lập luận về nguồn gốc và sự biến đổi của sự sống.</w:t>
       </w:r>
     </w:p>
     <w:p>
@@ -122,7 +138,7 @@
         <w:jc w:val="both"/>
       </w:pPr>
       <w:r>
-        <w:t>Bảo tàng ra đời năm 1907 từ đam mê của một nhà khoa học trẻ tên là Aleksandr Kots (Cốt) — nhà động vật học kiêm nghệ nhân nhồi thú tài hoa. Ý tưởng của ông rất táo bạo vào thời điểm ấy: thay vì chỉ sắp xếp mẫu vật theo họ, bộ, lớp như các bảo tàng truyền thống, ông muốn dùng chính những con thú, những bức tranh và pho tượng để minh hoạ từng chương của thuyết tiến hoá. Nhờ vậy, Bảo tàng Darwin được xem là bảo tàng tiến hoá đầu tiên của nhân loại. Đó là một tuyên ngôn khoa học được kể bằng ngôn ngữ của thị giác.</w:t>
+        <w:t>Bảo tàng ra đời năm 1907 từ đam mê của một nhà khoa học trẻ tên là Aleksandr Kots (Cốt) — nhà động vật học kiêm nghệ nhân nhồi thú tài hoa. Ý tưởng của ông rất táo bạo vào thời điểm ấy: thay vì chỉ sắp xếp mẫu vật theo họ, bộ, lớp như các bảo tàng truyền thống, ông muốn dùng chính những con thú, những bức tranh và pho tượng để minh hoạ từng chương của thuyết tiến hoá. Nhờ vậy, Bảo tàng Darwin được xem là bảo tàng tiến hoá đầu tiên của nhân loại — một tuyên ngôn khoa học được kể bằng ngôn ngữ của thị giác.</w:t>
       </w:r>
     </w:p>
     <w:p>
@@ -154,7 +170,7 @@
         <w:jc w:val="both"/>
       </w:pPr>
       <w:r>
-        <w:t>Không ồn ào như những điểm đến ở trung tâm, bảo tàng mang lại cảm giác thư thái, mát mẻ và giàu tri thức — nơi người ta có thể dành trọn nửa ngày mà không thấy chán. Với những ai yêu khoa học, đây gần như là một điểm hành hương; với những gia đình, đây là một sân chơi giáo dục; và với người lữ khách tò mò, đây là một lát cắt bất ngờ về tâm hồn học thuật của thủ đô nước Nga.</w:t>
+        <w:t>Không ồn ào như những điểm đến ở trung tâm, bảo tàng mang lại cảm giác thư thái, mát mẻ và giàu tri thức — nơi người ta có thể dành trọn nửa ngày mà không thấy chán. Với những ai yêu khoa học, đây gần như là một điểm hành hương; với các gia đình, đây là một sân chơi giáo dục; và với người lữ khách tò mò, đây là một lát cắt bất ngờ về tâm hồn học thuật của thủ đô nước Nga.</w:t>
       </w:r>
     </w:p>
     <w:p>
@@ -173,7 +189,7 @@
         <w:jc w:val="both"/>
       </w:pPr>
       <w:r>
-        <w:t>Bảo tàng Darwin toạ lạc tại số 57 phố Vavilova, quận Akademichesky, phía tây nam trung tâm Moskva, mã bưu chính 117292. Đây được xem là khu «phố khoa học» của thủ đô, nơi tập trung nhiều viện nghiên cứu thuộc Viện Hàn lâm Khoa học Nga — cái tên Akademichesky, mang nghĩa «thuộc về hàn lâm», cũng bắt nguồn từ đó. Toạ độ địa lý của bảo tàng vào khoảng 55,69° vĩ Bắc và 37,56° kinh Đông.</w:t>
+        <w:t>Bảo tàng Darwin toạ lạc tại số 57 phố Vavilova, quận Akademichesky, phía tây nam trung tâm Moskva, mã bưu chính 117292. Đây được xem là khu «phố khoa học» của thủ đô, nơi tập trung nhiều viện nghiên cứu thuộc Viện Hàn lâm Khoa học Nga — cái tên Akademichesky, mang nghĩa «thuộc về hàn lâm», cũng bắt nguồn từ đó.</w:t>
       </w:r>
     </w:p>
     <w:p>
@@ -197,7 +213,7 @@
         <w:jc w:val="both"/>
       </w:pPr>
       <w:r>
-        <w:t>Với người đi ô tô, bảo tàng có bãi đỗ xe riêng khoảng 45 chỗ, lối vào từ phía phố Vavilova. Tuy nhiên vào cuối tuần và các kỳ nghỉ, số chỗ trống rất hạn chế, nên nếu có thể, du khách vẫn nên ưu tiên phương tiện công cộng. Taxi và các ứng dụng gọi xe như Yandex Go cũng hoạt động phổ biến và tiện lợi ở khu vực này.</w:t>
+        <w:t>Với người đi ô tô, bảo tàng có bãi đỗ xe riêng khoảng 45 chỗ, lối vào từ phía phố Vavilova. Tuy nhiên vào cuối tuần và các kỳ nghỉ, số chỗ trống rất hạn chế, nên nếu có thể, du khách vẫn nên ưu tiên phương tiện công cộng. Taxi và các ứng dụng gọi xe như Yandex Go cũng hoạt động phổ biến ở khu vực này.</w:t>
       </w:r>
     </w:p>
     <w:p>
@@ -213,7 +229,7 @@
         <w:jc w:val="both"/>
       </w:pPr>
       <w:r>
-        <w:t>Bản thân khu vực quanh bảo tàng khá yên tĩnh và nhiều cây xanh, mang dáng dấp một quận dân cư trí thức hơn là một điểm du lịch nhộn nhịp. Điều này khiến chuyến đi tới đây có cảm giác thảnh thơi, dễ chịu, rất phù hợp để «đổi gió» sau những ngày rong ruổi ở khu trung tâm đông đúc. Chỉ cần bước qua cánh cổng bảo tàng, nhịp sống hối hả của đô thị dường như lùi lại phía sau.</w:t>
+        <w:t>Bản thân khu vực quanh bảo tàng khá yên tĩnh và nhiều cây xanh, mang dáng dấp một quận dân cư trí thức hơn là một điểm du lịch nhộn nhịp. Điều này khiến chuyến đi tới đây có cảm giác thảnh thơi, dễ chịu, rất phù hợp để «đổi gió» sau những ngày rong ruổi ở khu trung tâm đông đúc.</w:t>
       </w:r>
     </w:p>
     <w:p>
@@ -232,7 +248,7 @@
         <w:jc w:val="both"/>
       </w:pPr>
       <w:r>
-        <w:t>Câu chuyện của Bảo tàng Darwin gắn liền với một con người: Aleksandr Fyodorovich Kots (Cốt), sinh năm 1880 trong gia đình một trí thức gốc Đức — cha ông là nhà thực vật học kiêm nhà ngôn ngữ học Alfred Kots. Ngay từ nhỏ, Kots đã mê sưu tầm mẫu vật tự nhiên. Ông học nghề nhồi thú (taxidermy) một cách bài bản và giành huy chương vàng cho tài nghệ này khi mới 16 tuổi, năm 1896.</w:t>
+        <w:t>Câu chuyện của Bảo tàng Darwin gắn liền với một con người: Aleksandr Fyodorovich Kots (Cốt), sinh năm 1880 trong gia đình một trí thức gốc Đức. Ngay từ nhỏ, Kots đã mê sưu tầm mẫu vật tự nhiên; ông học nghề nhồi thú (taxidermy) một cách bài bản và giành huy chương vàng cho tài nghệ này khi mới 16 tuổi, năm 1896. Thời niên thiếu, cậu thường lang thang ở chợ Okhotny Ryad (Ô-khôt-nưi Ri-át, «Hàng Săn») và Quảng trường Trubnaya để mua chim thú về tự nhồi.</w:t>
       </w:r>
     </w:p>
     <w:p>
@@ -240,7 +256,7 @@
         <w:jc w:val="both"/>
       </w:pPr>
       <w:r>
-        <w:t>Năm 19 tuổi, chàng trai trẻ tham gia chuyến thám hiểm đầu tiên tới miền Tây Siberia, tự tay chế tác những con chim nhồi bông — chính là những hiện vật đầu tiên đặt nền móng cho bộ sưu tập tương lai. Kots tiếp tục trau dồi tay nghề tại xưởng nhồi thú của Lorenz (Lô-ren), phòng chế tác tiêu bản danh tiếng nhất Moskva khi ấy. Bước ngoặt tư tưởng đến khi ông du học châu Âu và tận mắt xem cách trưng bày về Darwin ở các bảo tàng lớn: ông choáng ngợp trước «sự phong phú của dữ kiện nhưng lại nghèo nàn trong cách truyền tải ý tưởng».</w:t>
+        <w:t>Một cột mốc ít người để ý nhưng lại là «ngày sinh thật» của bộ sưu tập: ngày 28 tháng 2 năm 1907, chàng Kots bỏ ra 15 rúp — gấp khoảng năm lần giá thường — để mua một con thỏ rừng lông đen hiếm gặp (biến dị hắc tố) từ xưởng nhồi thú Lorenz. Con thỏ ấy được ghi vào sổ kiểm kê dưới ký hiệu số 1, và cho tới nay vẫn được coi là hiện vật đầu tiên khai sinh bảo tàng. Cùng năm 1907, Kots được mời giảng về học thuyết Darwin tại Trường Cao đẳng Nữ sinh Moskva; ông chuyển toàn bộ bộ sưu tập cá nhân vào phòng thí nghiệm động vật học của trường và đăng ký nó dưới tên «Bảo tàng Học thuyết Tiến hoá».</w:t>
       </w:r>
     </w:p>
     <w:p>
@@ -248,7 +264,7 @@
         <w:jc w:val="both"/>
       </w:pPr>
       <w:r>
-        <w:t>Từ nỗi thất vọng ấy nảy sinh một khát vọng: xây dựng một bảo tàng vừa cung cấp tri thức lý thuyết vừa có bằng chứng trực quan sống động về tiến hoá. Cơ hội đến năm 1907, khi Kots được mời giảng dạy về học thuyết Darwin tại Trường Cao đẳng Nữ sinh Moskva. Ông chuyển toàn bộ bộ sưu tập cá nhân vào phòng thí nghiệm động vật học của trường và đăng ký nó dưới tên «Bảo tàng Học thuyết Tiến hoá». Năm 1907 vì thế được coi là năm khai sinh bảo tàng.</w:t>
+        <w:t>Điều đặc biệt là Kots sắp xếp mẫu vật không theo phân loại sinh học truyền thống, mà theo «từng chương của thuyết tiến hoá»: địa lý sinh vật, biến dị theo tuổi và cá thể, sự thích nghi, thuyết Mendel, thuyết Lamarck (La-mác) và nguồn gốc loài người. Năm 1911, ông kết hôn với Nadezhda Ladygina (Na-đe-giơ-đa La-đư-ghi-na), một nữ sinh xuất sắc và về sau trở thành nhà tâm lý học động vật hàng đầu. Suốt nửa thế kỷ, hai vợ chồng cùng nhau chắt chiu từng đồng để mua thêm mẫu vật, sách vở và tranh ảnh.</w:t>
       </w:r>
     </w:p>
     <w:p>
@@ -256,7 +272,7 @@
         <w:jc w:val="both"/>
       </w:pPr>
       <w:r>
-        <w:t>Điều đặc biệt là Kots sắp xếp mẫu vật không theo phân loại sinh học truyền thống, mà theo «từng chương của thuyết tiến hoá»: địa lý sinh vật, biến dị theo tuổi và cá thể, sự thích nghi, thuyết Mendel, thuyết Lamarck (La-mác) và nguồn gốc loài người. Năm 1911, ông kết hôn với Nadezhda Ladygina (Na-đe-giơ-đa La-đư-ghi-na), một nữ sinh xuất sắc và về sau trở thành nhà tâm lý học động vật hàng đầu. Suốt nửa thế kỷ, hai vợ chồng cùng nhau chắt chiu từng đồng để mua thêm mẫu vật, sách vở và tranh ảnh cho bảo tàng.</w:t>
+        <w:t>Năm 1913, cặp đôi sang châu Âu, mua tiêu bản quý từ các hãng nhồi thú ở London, Berlin, Hamburg và Halle, đồng thời sưu tầm sách sinh học và cả những lá thư gốc của chính Charles Darwin. Một cú hích lớn đến quanh năm 1919–1920 với bộ sưu tập Khomyakov (Khô-mi-a-cốp) chuyển về: hàng nghìn tiêu bản nhiệt đới, trong đó có 178 chim thiên đường, 558 chim ruồi, một con anca lớn không cánh và một bộ xương chim dodo gần hoàn chỉnh, kèm cả thư viện hơn 400 đầu sách.</w:t>
       </w:r>
     </w:p>
     <w:p>
@@ -264,7 +280,7 @@
         <w:jc w:val="both"/>
       </w:pPr>
       <w:r>
-        <w:t>Năm 1913, cặp đôi sang châu Âu, mua tiêu bản quý từ các hãng nhồi thú ở London, Berlin, Hamburg và Halle, đồng thời sưu tầm sách sinh học và năm bức thư gốc của chính Charles Darwin. Cách mạng 1917 với đói rét, hỗn loạn cũng không làm gián đoạn công việc của họ. Năm 1918, bộ sưu tập được cấp «giấy bảo hộ» công nhận là tài sản có giá trị khoa học lớn, giúp nó thoát khỏi nguy cơ bị bán tháo. Đến năm 1922, bảo tàng chính thức trở thành một cơ quan nhà nước độc lập.</w:t>
+        <w:t>Cách mạng 1917 với đói rét, hỗn loạn cũng không làm gián đoạn công việc của họ. Năm 1918, bộ sưu tập được cấp «giấy bảo hộ» công nhận là tài sản khoa học có giá trị, giúp nó thoát khỏi nguy cơ bị bán tháo; đến năm 1922, bảo tàng chính thức trở thành một cơ quan nhà nước độc lập. Chính quyền Xô-viết ban đầu ủng hộ vì thuyết tiến hoá phù hợp với thế giới quan duy vật.</w:t>
       </w:r>
     </w:p>
     <w:p>
@@ -272,7 +288,7 @@
         <w:jc w:val="both"/>
       </w:pPr>
       <w:r>
-        <w:t>Chính quyền Xô-viết ban đầu ủng hộ bảo tàng vì thuyết tiến hoá phù hợp với thế giới quan duy vật. Nhưng bi kịch đến với ngành sinh học Nga khi Trofim Lysenko (Lư-xen-cô) — người bác bỏ di truyền học Mendel — được Stalin hậu thuẫn. Để bảo vệ công trình, vợ chồng Kots phải giấu tài liệu di truyền học giữa đống thú nhồi trong tầng hầm, và khôn khéo đặt một pho tượng Lamarck ngay lối vào để làm «bình phong». Kots giữ cương vị giám đốc cho tới khi qua đời năm 1964.</w:t>
+        <w:t>Nhưng bi kịch đến với ngành sinh học Nga khi Trofim Lysenko (Lư-xen-cô) — người bác bỏ di truyền học Mendel — được Stalin hậu thuẫn. Để bảo vệ công trình, vợ chồng Kots phải giấu tài liệu di truyền học giữa đống thú nhồi trong tầng hầm, và khôn khéo đặt một pho tượng Lamarck ngay lối vào để làm «bình phong». Kots giữ cương vị giám đốc cho tới khi qua đời năm 1964.</w:t>
       </w:r>
     </w:p>
     <w:p>
@@ -280,7 +296,7 @@
         <w:jc w:val="both"/>
       </w:pPr>
       <w:r>
-        <w:t>Suốt hàng chục năm, giấc mơ về một toà nhà riêng vẫn dang dở dù nhiều lần được chính quyền hứa hẹn từ thập niên 1920. Phải đến năm 1994, chính quyền Moskva mới cấp cho bảo tàng toà nhà trên phố Vavilova, và gian trưng bày thường trực đầu tiên mở cửa năm 1995 — hơn ba mươi năm sau khi người sáng lập qua đời. Từ năm 1988, bà Anna Klyukina (An-na Cli-u-ki-na) đảm nhiệm vị trí giám đốc và đưa bảo tàng bước vào thời kỳ hiện đại hoá mạnh mẽ. Năm 2007, đúng dịp tròn 100 tuổi, Bảo tàng Darwin giành giải Grand Prix tại liên hoan «Intermuseum» và được vinh danh là bảo tàng xuất sắc nhất trong năm.</w:t>
+        <w:t>Suốt hàng chục năm, giấc mơ về một toà nhà riêng vẫn dang dở dù nhiều lần được chính quyền hứa hẹn từ thập niên 1920. Phải đến giữa thập niên 1990, gian trưng bày thường trực đầu tiên trên phố Vavilova mới mở cửa (năm 1995) — hơn ba mươi năm sau khi người sáng lập qua đời. Từ năm 1988, bà Anna Klyukina (An-na Cli-u-ki-na) đảm nhiệm vị trí giám đốc và đưa bảo tàng bước vào thời kỳ hiện đại hoá mạnh mẽ; năm 2007, đúng dịp tròn 100 tuổi, bảo tàng khánh thành thêm khối triển lãm mới và giành giải Grand Prix tại liên hoan «Intermuseum».</w:t>
       </w:r>
     </w:p>
     <w:p>
@@ -291,7 +307,7 @@
         <w:rPr>
           <w:color w:val="152C4E"/>
         </w:rPr>
-        <w:t>Kiến trúc &amp; đặc điểm nổi bật</w:t>
+        <w:t>Kiến trúc &amp; bố cục toà nhà</w:t>
       </w:r>
     </w:p>
     <w:p>
@@ -307,7 +323,7 @@
         <w:jc w:val="both"/>
       </w:pPr>
       <w:r>
-        <w:t>Bản thiết kế mang phong cách Hiện đại (Modernism) — một lựa chọn dũng cảm trong thời kỳ Liên Xô đang cổ vũ lối kiến trúc lắp ghép tiêu chuẩn hoá và bài trừ «sự rườm rà kiến trúc». Nhóm thiết kế phải nhiều lần điều chỉnh, chuyển từ tường gạch sang kết cấu lắp ghép, và phải xin giấy phép đặc biệt để thực hiện chiếc giếng trời bằng kính hình tam giác đặc trưng. Việc thi công khởi công năm 1974 trên phố Vavilova và kéo dài suốt hai mươi năm vì kinh phí liên tục bị gián đoạn.</w:t>
+        <w:t>Bản thiết kế mang phong cách hiện đại — một lựa chọn dũng cảm trong thời kỳ Liên Xô đang cổ vũ lối kiến trúc lắp ghép tiêu chuẩn hoá. Nhóm thiết kế phải nhiều lần điều chỉnh và xin giấy phép đặc biệt để thực hiện chiếc giếng trời bằng kính hình tam giác đặc trưng. Việc thi công trên phố Vavilova kéo dài tới hai mươi năm vì kinh phí liên tục bị gián đoạn, và cuối cùng toà nhà chính ba tầng mở cửa đón khách năm 1995.</w:t>
       </w:r>
     </w:p>
     <w:p>
@@ -315,7 +331,7 @@
         <w:jc w:val="both"/>
       </w:pPr>
       <w:r>
-        <w:t>Cuối cùng, ngày 2 tháng 8 năm 1995, toà nhà chính ba tầng mở cửa đón khách, hiện thực hoá nhiều ý tưởng trưng bày mà Kots ấp ủ cả đời. Không gian bên trong được tổ chức theo lối kể chuyện: tầng trệt giới thiệu lịch sử bảo tàng và sự đa dạng của sự sống, các tầng trên dẫn dắt người xem qua tiến hoá vi mô, tiến hoá vĩ mô, địa lý sinh vật và lịch sử tư tưởng khoa học. Trung tâm toà nhà là một sảnh lớn thông tầng, tràn ngập ánh sáng tự nhiên từ giếng trời.</w:t>
+        <w:t>Không gian bên trong được tổ chức theo lối kể chuyện. Tầng trệt giới thiệu lịch sử bảo tàng và sự đa dạng của sự sống; các tầng trên dẫn dắt người xem qua các bước nhận thức thiên nhiên, tiến hoá vi mô, địa lý sinh vật rồi tiến hoá vĩ mô. Trung tâm toà nhà là một sảnh lớn thông tầng, tràn ngập ánh sáng tự nhiên từ giếng trời — người xem có thể đứng ở tầng trệt ngước nhìn suốt lên nóc.</w:t>
       </w:r>
     </w:p>
     <w:p>
@@ -323,7 +339,7 @@
         <w:jc w:val="both"/>
       </w:pPr>
       <w:r>
-        <w:t>Năm 1996, ngay cạnh toà nhà chính, giai đoạn xây dựng thứ hai bắt đầu — một khối triển lãm nhiều tầng, hoàn thành vào năm 2007. Khối nhà này chứa kho lưu giữ hiện vật cùng nhiều không gian dành cho các cuộc trưng bày tạm thời. Hai toà nhà được nối với nhau bằng một đường hầm đi bộ dưới lòng đất, giúp du khách di chuyển thuận tiện mà không phải ra ngoài trời giữa mùa đông giá lạnh.</w:t>
+        <w:t>Năm 1996, ngay cạnh toà nhà chính, giai đoạn xây dựng thứ hai bắt đầu — một khối triển lãm nhiều tầng, hoàn thành năm 2007, chứa kho hiện vật cùng nhiều không gian trưng bày tạm thời. Hai toà nhà được nối với nhau bằng một đường hầm đi bộ dưới lòng đất, giúp du khách di chuyển thuận tiện mà không phải ra ngoài trời giữa mùa đông giá lạnh. Theo trang chính thức, tổng diện tích ba toà nhà của bảo tàng vượt 20.000 m², riêng không gian trưng bày hiện đại khoảng 5.000 m².</w:t>
       </w:r>
     </w:p>
     <w:p>
@@ -331,15 +347,7 @@
         <w:jc w:val="both"/>
       </w:pPr>
       <w:r>
-        <w:t>Điểm nhấn kiến trúc – trưng bày nổi bật nhất chính là màn trình diễn ánh sáng – hình ảnh – âm nhạc mang tên «Hành tinh Sống» (Живая планета). Trong không gian tối, hình ảnh và âm thanh phối hợp đưa người xem ngược dòng thời gian 4,5 tỷ năm, tái hiện hành trình sự sống trên Trái Đất từ thuở sơ khai cho đến hiện tại. Đây là một trong những «đặc sản» khiến bảo tàng khác biệt hẳn so với các bảo tàng lịch sử tự nhiên cổ điển.</w:t>
-      </w:r>
-    </w:p>
-    <w:p>
-      <w:pPr>
-        <w:jc w:val="both"/>
-      </w:pPr>
-      <w:r>
-        <w:t>Bên ngoài, trước cửa bảo tàng là một «công viên cổ sinh» (paleopark) nhỏ với các mô hình sinh vật thời tiền sử đặt lộ thiên: voi ma-mút, tê giác lông mượt, sư tử hang, cùng nhiều loài bò sát và lưỡng cư cổ đại. Trên nóc khối triển lãm còn có khu sân thượng mở cho khách tham quan ngắm cảnh. Tổng thể, kiến trúc nơi đây tuy không cầu kỳ hoa mỹ nhưng lại rất «biết kể chuyện», phục vụ trọn vẹn cho sứ mệnh giáo dục khoa học của bảo tàng.</w:t>
+        <w:t>Ngoài các gian chính, toà nhà còn có rạp chiếu phim (chiếu phim 3D về khủng long và bò sát biển), một nhà kính (orangery) rộng chừng 218 m² với hơn 100 loài cây nhiệt đới và cận nhiệt, khu «trưng bày sống» nuôi khoảng 20 loài côn trùng – nhện – bọ cạp, và khu sân thượng mở cho khách ngắm cảnh vào mùa hè (khoảng giữa tháng 5 đến giữa tháng 9). Trước cửa là «công viên cổ sinh» (paleopark) ngoài trời khai trương năm 2015.</w:t>
       </w:r>
     </w:p>
     <w:p>
@@ -350,7 +358,7 @@
         <w:rPr>
           <w:color w:val="152C4E"/>
         </w:rPr>
-        <w:t>Những điểm nhấn không thể bỏ lỡ</w:t>
+        <w:t>Tham quan tầng trệt: «Đa dạng sự sống trên Trái Đất» &amp; show «Hành tinh Sống»</w:t>
       </w:r>
     </w:p>
     <w:p>
@@ -358,7 +366,7 @@
         <w:jc w:val="both"/>
       </w:pPr>
       <w:r>
-        <w:t>Nếu chỉ có thời gian ngắn, du khách nhất định nên tìm đến bộ sưu tập trứ danh nhất của bảo tàng: các dạng «biến dị màu sắc» (aberrant) — được coi là lớn nhất thế giới. Đây là những con chim và thú mang màu lông khác thường so với đồng loại, thành quả của mối quan tâm đặc biệt mà đích thân Kots dành cho hiện tượng bạch tạng (albino) và hắc tố (melanism). Bộ sưu tập quy tụ khoảng 800 con thú hiếm, trong đó có 34 cá thể bạch tạng thuần.</w:t>
+        <w:t>Bắt đầu chuyến đi ở tầng trệt, du khách gặp ngay gian «Век Дарвиновского музея» — «Một thế kỷ Bảo tàng Darwin», kể lại câu chuyện của vợ chồng Kots qua ảnh tư liệu và những kỷ vật cá nhân. Hướng dẫn viên nên mở đầu bằng chính con thỏ đen «ký hiệu số 1» ở đây: cả một bảo tàng 400.000 hiện vật đã lớn lên từ một con thỏ mua ở chợ.</w:t>
       </w:r>
     </w:p>
     <w:p>
@@ -366,7 +374,7 @@
         <w:jc w:val="both"/>
       </w:pPr>
       <w:r>
-        <w:t>Nổi bật trong nhóm này là triển lãm «Một trên mười nghìn» — cái tên gợi đúng độ hiếm của những cá thể mang màu sắc dị biệt trong tự nhiên. Ở đây có sóc, nhím, chuột chũi với bộ lông kỳ lạ, cùng những con vật bạch tạng quý như thỏ Mãn Châu, hươu xạ Siberia hay chuột chũi nước desman của Nga. Với người yêu thiên nhiên, đây là cơ hội hiếm hoi để tận mắt thấy những «biến tấu» bất ngờ của tạo hoá.</w:t>
+        <w:t>Trái tim của tầng trệt là đại sảnh «Đa dạng sự sống trên Trái Đất» (Многообразие жизни на Земле) — gian trưng bày hoành tráng nhất, tái hiện muôn loài của mọi châu lục trong các diorama theo đới khí hậu: từ rừng nhiệt đới, thảo nguyên châu Phi, sa mạc cho tới vùng cực. Thú, chim, côn trùng và vỏ ốc được sắp đặt như đang sống trong môi trường thật, giúp khách Việt dễ hình dung «cây sự sống» trải khắp hành tinh.</w:t>
       </w:r>
     </w:p>
     <w:p>
@@ -374,7 +382,7 @@
         <w:jc w:val="both"/>
       </w:pPr>
       <w:r>
-        <w:t>Điểm nhấn thứ hai là bộ sưu tập những loài đã tuyệt chủng — những «hồn ma» của thế giới động vật. Bảo tàng lưu giữ bộ xương chim dodo (đô-đô), loài chim không biết bay từng sống ở đảo Mauritius và bị tuyệt diệt vào cuối thế kỷ 17, cùng tiêu bản chim anca lớn không cánh, bồ câu viễn khách và chim huia. Mỗi hiện vật ở đây là một lời nhắc nhở lặng lẽ về sự mong manh của các loài trước bàn tay con người.</w:t>
+        <w:t>Ngay trong khu «thảo nguyên châu Phi» có một nhân vật đặc biệt để dừng lại kể chuyện: con voi châu Phi từng thuộc về gia đình Nga hoàng Nikolai II. Đây là một trong những tiêu bản lớn và nổi tiếng nhất bảo tàng (câu chuyện «con voi ướp muối» sẽ được kể kỹ ở phần sau) — một điểm nhấn ăn ảnh mà đoàn khách rất thích chụp cùng.</w:t>
       </w:r>
     </w:p>
     <w:p>
@@ -382,7 +390,18 @@
         <w:jc w:val="both"/>
       </w:pPr>
       <w:r>
-        <w:t>Không thể bỏ qua bộ sưu tập tranh và tượng động vật, một nét độc đáo bậc nhất của Bảo tàng Darwin. Chính tại đây, danh hoạ Vasily Vatagin (Va-xi-li Va-ta-ghin) — nhà động vật học kiêm hoạ sĩ, viện sĩ Viện Hàn lâm Nghệ thuật — đã cùng đồng nghiệp gây dựng nên cả một trường phái vẽ động vật của Moskva. Bên cạnh Vatagin còn có Aleksey Komarov (A-lếch-xây Cô-ma-rốp) và nhiều tên tuổi khác; tổng cộng bảo tàng lưu giữ khoảng 1.850 tác phẩm hội hoạ.</w:t>
+        <w:t>Điểm nhấn không thể bỏ lỡ ở gian này là màn trình diễn ánh sáng – hình ảnh – âm nhạc «Hành tinh Sống» (Живая планета). Đèn trong sảnh tắt dần, hình ảnh và âm thanh phối hợp đưa người xem ngược dòng 4,5 tỷ năm, từ Trái Đất sơ khai tới thế giới sinh vật ngày nay, ngay trên nền các diorama. Suất diễn thường vào các khung giờ cố định trong ngày (nên hỏi lại quầy vé giờ chính xác trong ngày tham quan). Gợi ý cho hướng dẫn viên: canh lịch để đoàn xem show này — nó gây ấn tượng mạnh và là «đặc sản» phân biệt Darwin với mọi bảo tàng tự nhiên khác.</w:t>
+      </w:r>
+    </w:p>
+    <w:p>
+      <w:pPr>
+        <w:pStyle w:val="Heading1"/>
+      </w:pPr>
+      <w:r>
+        <w:rPr>
+          <w:color w:val="152C4E"/>
+        </w:rPr>
+        <w:t>Tầng 1: «Các bước nhận thức thiên nhiên» &amp; «Tiến hoá vi mô»</w:t>
       </w:r>
     </w:p>
     <w:p>
@@ -390,7 +409,7 @@
         <w:jc w:val="both"/>
       </w:pPr>
       <w:r>
-        <w:t>Với những ai yêu sách, bảo tàng cất giữ khoảng 9.000 ấn phẩm và tư liệu về thiên nhiên, trong đó có ấn bản đầu tiên của cuốn «Nguồn gốc các loài», những lá thư tay của Darwin và nhiều sách cổ về lịch sử tự nhiên. Một trong những báu vật hiếm nhất là cuốn «Lịch sử các loài rắn và rồng» của học giả người Ý Ulisse Aldrovandi (U-lít-xê An-đrô-van-đi). Đây là kho tàng vô giá đối với giới nghiên cứu và những người yêu lịch sử khoa học.</w:t>
+        <w:t>Lên tầng 1, gian «Các bước nhận thức thiên nhiên» (Этапы познания живой природы) kể lại lịch sử khoa học tự nhiên từ thời cổ đại tới Darwin: con người đã dần hiểu về sự sống ra sao, từ các nhà tự nhiên học Hy Lạp cho tới các nhà phân loại thế kỷ 18. Đây là phần «dẫn nhập tư tưởng» rất hợp để hướng dẫn viên tóm tắt bối cảnh thuyết tiến hoá.</w:t>
       </w:r>
     </w:p>
     <w:p>
@@ -398,7 +417,281 @@
         <w:jc w:val="both"/>
       </w:pPr>
       <w:r>
-        <w:t>Cuối cùng, hãy dành thời gian cho gian tái hiện đại Trung sinh với những mô hình khủng long chuyển động, và cho khối triển lãm phía sau với hành trình «Đi theo con đường tiến hoá» (Пройди путём эволюции). Ở đó còn có khu côn trùng sống «MiniZoo», nhà kính, rạp chiếu phim vòm kỹ thuật số và các trò chơi 4D, 5D. Chỉ riêng những điểm nhấn này cũng đủ để lấp đầy nửa ngày khám phá đầy hào hứng.</w:t>
+        <w:t>Điểm gây bất ngờ cho khách trong gian này là mô hình tái hiện góc ca-bin của Charles Darwin trên con tàu HMS Beagle — con tàu đã đưa Darwin đi vòng quanh thế giới và tích luỹ những quan sát làm nên «Nguồn gốc các loài». Đứng trước góc phòng chật hẹp ấy, du khách cảm nhận rõ hơn hành trình gian nan phía sau một học thuyết vĩ đại.</w:t>
+      </w:r>
+    </w:p>
+    <w:p>
+      <w:pPr>
+        <w:jc w:val="both"/>
+      </w:pPr>
+      <w:r>
+        <w:t>Gian «Tiến hoá vi mô» (Микроэволюция) minh hoạ cách các loài biến đổi và tách loài. Ở đây có một bộ sưu tập rất «biết nói»: hơn ba mươi con cáo với đủ sắc lông khác nhau xếp cạnh nhau, cho thấy sự đa dạng ngay trong cùng một loài; cạnh đó là một con mèo không đuôi — ví dụ sinh động về đột biến. Với khách Việt, cách trực quan này giúp hiểu khái niệm «biến dị» mà không cần thuật ngữ hàn lâm.</w:t>
+      </w:r>
+    </w:p>
+    <w:p>
+      <w:pPr>
+        <w:jc w:val="both"/>
+      </w:pPr>
+      <w:r>
+        <w:t>Gợi ý cách kể: hãy để khách tự tìm điểm khác nhau giữa những con cáo, rồi mới «chốt» rằng chọn lọc tự nhiên chính là quá trình giữ lại những biến dị có lợi qua nhiều thế hệ. Cách đặt câu hỏi trước – giải thích sau khiến gian trưng bày trở thành một trò chơi quan sát thú vị cho cả gia đình.</w:t>
+      </w:r>
+    </w:p>
+    <w:p>
+      <w:pPr>
+        <w:pStyle w:val="Heading1"/>
+      </w:pPr>
+      <w:r>
+        <w:rPr>
+          <w:color w:val="152C4E"/>
+        </w:rPr>
+        <w:t>Tầng 2: «Địa lý sinh vật» &amp; «Tiến hoá vĩ mô» — nguồn gốc loài người</w:t>
+      </w:r>
+    </w:p>
+    <w:p>
+      <w:pPr>
+        <w:jc w:val="both"/>
+      </w:pPr>
+      <w:r>
+        <w:t>Tầng 2 mở ra với gian «Địa lý sinh vật» (Зоогеография), lý giải vì sao mỗi vùng đất trên thế giới lại có hệ động vật riêng: chuột túi ở Úc, lạc đà không bướu ở Nam Mỹ, gấu trúc ở Trung Hoa… Bản đồ và các nhóm tiêu bản theo châu lục giúp khách thấy rõ mối liên hệ giữa địa lý, khí hậu và tiến hoá.</w:t>
+      </w:r>
+    </w:p>
+    <w:p>
+      <w:pPr>
+        <w:jc w:val="both"/>
+      </w:pPr>
+      <w:r>
+        <w:t>Gian «Tiến hoá vĩ mô» (Макроэволюция) đưa người xem xuống chiều sâu thời gian địa chất: hoá thạch lưỡng cư cổ, các mẫu vật liên quan tới khủng long, và đặc biệt là khu về nguồn gốc loài người. Tại đây trưng bày chuỗi phục dựng sọ và tượng bán thân từ vượn người phương Nam (australopithecus) qua người đứng thẳng cho tới người hiện đại — một «gia phả» trực quan của loài người.</w:t>
+      </w:r>
+    </w:p>
+    <w:p>
+      <w:pPr>
+        <w:jc w:val="both"/>
+      </w:pPr>
+      <w:r>
+        <w:t>Đây thường là phần khiến khách người lớn nán lại lâu nhất, vì nó chạm tới câu hỏi muôn thuở «con người đến từ đâu». Hướng dẫn viên nên nhấn mạnh rằng đây chính là đỉnh của mạch kể toàn bảo tàng: từ con thỏ đen ở tầng trệt, qua muôn loài và cơ chế biến đổi, cuối cùng dẫn tới chính chúng ta.</w:t>
+      </w:r>
+    </w:p>
+    <w:p>
+      <w:pPr>
+        <w:jc w:val="both"/>
+      </w:pPr>
+      <w:r>
+        <w:t>Gợi ý cách kể cho khách Việt: có thể liên hệ nhẹ nhàng với việc Bảo tàng Darwin ra đời để phổ biến một ý tưởng từng gây tranh cãi khắp thế giới — rằng muôn loài, kể cả con người, đều có chung một cội nguồn và cùng biến đổi theo thời gian.</w:t>
+      </w:r>
+    </w:p>
+    <w:p>
+      <w:pPr>
+        <w:pStyle w:val="Heading1"/>
+      </w:pPr>
+      <w:r>
+        <w:rPr>
+          <w:color w:val="152C4E"/>
+        </w:rPr>
+        <w:t>«Ký hiệu số 1»: con thỏ đen và bộ sưu tập biến dị màu sắc</w:t>
+      </w:r>
+    </w:p>
+    <w:p>
+      <w:pPr>
+        <w:jc w:val="both"/>
+      </w:pPr>
+      <w:r>
+        <w:t>Nếu chỉ được xem một thứ, hãy tìm đến bộ sưu tập trứ danh nhất của bảo tàng: các dạng «biến dị màu sắc» (aberrant) — những con chim, thú mang màu lông khác thường so với đồng loại. Đây là niềm say mê riêng của Kots với hai hiện tượng bạch tạng (albino, lông trắng) và hắc tố (melanism, lông đen). Bảo tàng mô tả đây là một trong những bộ sưu tập dạng này lớn nhất — theo chính họ là lớn nhất nước Nga (nhiều tài liệu du lịch còn nói lớn nhất thế giới; nên dùng cách nói thận trọng «vào loại lớn nhất»).</w:t>
+      </w:r>
+    </w:p>
+    <w:p>
+      <w:pPr>
+        <w:jc w:val="both"/>
+      </w:pPr>
+      <w:r>
+        <w:t>Cả bộ sưu tập bắt đầu từ con thỏ rừng lông đen «ký hiệu số 1» năm 1907 đã nhắc ở trên. Về sau nó lớn dần: hơn 600 con gà gô (đặc biệt là gà gô đen) mang sắc lông dị thường, khoảng 178 con cáo dị sắc dạng nhồi cùng gần 150 tấm da, thêm công trắng, linh miêu trắng, sói trắng và sói đen, thỏ Mãn Châu bạch tạng, hươu xạ bạch tạng, chuột chũi nước desman bạch tạng, cùng vô số sóc, nhím, chuột chũi màu lạ.</w:t>
+      </w:r>
+    </w:p>
+    <w:p>
+      <w:pPr>
+        <w:jc w:val="both"/>
+      </w:pPr>
+      <w:r>
+        <w:t>Chủ đề này thường được giới thiệu qua triển lãm mang tên gợi nhớ tỉ lệ «một trên mười nghìn» — đúng bằng độ hiếm của bạch tạng trong tự nhiên (khoảng 1–2 cá thể trên mỗi 10.000 con). Trong dịp kỷ niệm 110 năm (2017), bảo tàng từng đưa ra trưng bày khoảng 30 con thú dị sắc quý, nhiều con lần đầu rời kho sau cả trăm năm.</w:t>
+      </w:r>
+    </w:p>
+    <w:p>
+      <w:pPr>
+        <w:jc w:val="both"/>
+      </w:pPr>
+      <w:r>
+        <w:t>Gợi ý cách kể: hãy hỏi khách «trong tự nhiên, một con vật lông trắng toát hoặc đen tuyền sẽ dễ sống hay dễ chết?» — rồi dẫn tới ý niệm chọn lọc tự nhiên, vì màu sắc bất thường thường khiến con vật dễ bị phát hiện. Chính vì hiếm và khó sống sót, mỗi tiêu bản ở đây mới quý đến vậy.</w:t>
+      </w:r>
+    </w:p>
+    <w:p>
+      <w:pPr>
+        <w:pStyle w:val="Heading1"/>
+      </w:pPr>
+      <w:r>
+        <w:rPr>
+          <w:color w:val="152C4E"/>
+        </w:rPr>
+        <w:t>Bàn tay nghệ nhân: gia đình Fedulov, người thầy Lorentz &amp; con voi ướp muối của Nga hoàng</w:t>
+      </w:r>
+    </w:p>
+    <w:p>
+      <w:pPr>
+        <w:jc w:val="both"/>
+      </w:pPr>
+      <w:r>
+        <w:t>Một bảo tàng thú nhồi sống hay chết là nhờ tay nghề nghệ nhân. Kots học nghề từ Fyodor Lorentz (Ph. Lô-ren) — bậc thầy nhồi thú danh tiếng nhất Moskva đầu thế kỷ 20; sau khi Lorentz qua đời (1909), Kots gần như tiếp quản xưởng của ông. Đến nay bảo tàng còn giữ hàng trăm tiêu bản chim và thú từ xưởng Lorentz.</w:t>
+      </w:r>
+    </w:p>
+    <w:p>
+      <w:pPr>
+        <w:jc w:val="both"/>
+      </w:pPr>
+      <w:r>
+        <w:t>Nhưng người được Kots gọi là «nghệ nhân nhồi thú giỏi nhất châu Âu» lại là Filipp Fedulov (Phi-líp Fê-đu-lốp, 1881–1962), gắn bó với bảo tàng khoảng 43 năm và chuyên các tiêu bản lớn, phức tạp. Cháu ông, Dmitry Fedulov (1896–1985), làm ở bảo tàng tới 61 năm và chuyên tiêu bản nhỏ, tinh xảo — riêng ông đã làm hơn 200 con chim ruồi. Hai chú cháu nhà Fedulov cùng nhau tạo ra hơn 4.500 tiêu bản. Kots từng viết: «Không có Fedulov thì không có bảo tàng».</w:t>
+      </w:r>
+    </w:p>
+    <w:p>
+      <w:pPr>
+        <w:jc w:val="both"/>
+      </w:pPr>
+      <w:r>
+        <w:t>Tác phẩm nổi tiếng nhất của Filipp Fedulov là con voi châu Phi từng thuộc vườn thú của gia đình Nga hoàng ở Tsarskoye Selo. Con voi chết trên đường đưa về Moskva; bộ da nặng hơn một tấn phải nằm trong thùng muối suốt gần một thập niên, cho tới năm 1927 Fedulov mới nhồi thành công — ghép thành nhiều phần cho dễ di chuyển, dùng ngà gỗ và «cơ bắp» độn rơm. Một chi tiết dễ gây xúc động: nữ thi sĩ Nga Anna Akhmatova thuở nhỏ ở Tsarskoye Selo từng rất yêu quý chính con voi này.</w:t>
+      </w:r>
+    </w:p>
+    <w:p>
+      <w:pPr>
+        <w:jc w:val="both"/>
+      </w:pPr>
+      <w:r>
+        <w:t>Bảo tàng còn tự hào có cả một bộ sưu tập tranh và tượng động vật mà Kots ví là «phòng tranh Tretyakov của sinh học». Linh hồn của bộ sưu tập là danh hoạ Vasily Vatagin (Va-xi-li Va-ta-ghin, 1884–1969) — hoạ sĩ – nhà điêu khắc động vật hàng đầu nước Nga, cộng tác với bảo tàng từ năm 1908; hơn 50 tác phẩm của ông có mặt trong trưng bày thường trực, kể cả những hình voi vẽ trên tường gian trưng bày. Bên cạnh ông là Konstantin Flyorov (1904–1980), vừa là hoạ sĩ vừa là nhà cổ sinh vật học về động vật có xương sống.</w:t>
+      </w:r>
+    </w:p>
+    <w:p>
+      <w:pPr>
+        <w:pStyle w:val="Heading1"/>
+      </w:pPr>
+      <w:r>
+        <w:rPr>
+          <w:color w:val="152C4E"/>
+        </w:rPr>
+        <w:t>Chim dodo và những loài đã tuyệt chủng</w:t>
+      </w:r>
+    </w:p>
+    <w:p>
+      <w:pPr>
+        <w:jc w:val="both"/>
+      </w:pPr>
+      <w:r>
+        <w:t>Trong nhóm hiện vật «hồn ma của thế giới động vật», quý nhất là bộ xương chim dodo (dronte, Raphus cucullatus) — bộ (gần) hoàn chỉnh duy nhất ở Nga. Xương được tìm thấy ở đảo Mauritius cuối thế kỷ 19, lắp ráp tại nhà tự nhiên học lừng danh Deyrolle (Đề-roi) ở Paris, rồi được nhà bảo trợ Aleksey Khomyakov mua và tặng lại bảo tàng khi ông rời nước Nga (khoảng 1919).</w:t>
+      </w:r>
+    </w:p>
+    <w:p>
+      <w:pPr>
+        <w:jc w:val="both"/>
+      </w:pPr>
+      <w:r>
+        <w:t>Dodo là loài chim không biết bay sống ở Mauritius; vì trên đảo không có thú săn mồi và thức ăn sẵn dưới đất nên nó dần mất khả năng bay, để rồi bị tuyệt diệt khoảng năm 1700 khi thuỷ thủ cùng chuột, chó, lợn theo tàu ăn trứng và chim non. Một chi tiết vui để kể cho khách: nhà văn Lewis Carroll đã đưa chim Dodo vào «Alice ở xứ sở thần tiên» — nhiều người tin đó là hình ảnh tự trào của chính ông, vì ông nói lắp, hay lặp «Do-Do-Dodgson» (Dodgson là họ thật của ông).</w:t>
+      </w:r>
+    </w:p>
+    <w:p>
+      <w:pPr>
+        <w:jc w:val="both"/>
+      </w:pPr>
+      <w:r>
+        <w:t>Cùng thuộc bộ sưu tập Khomyakov còn có tiêu bản chim anca lớn (great auk) — loài chim biển không cánh bay đã tuyệt chủng năm 1844, và bồ câu viễn khách (passenger pigeon) — loài từng có hàng tỷ cá thể ở Bắc Mỹ nhưng bị săn đến con cuối cùng vào đầu thế kỷ 20. Mỗi tiêu bản là một lời nhắc lặng lẽ về sự mong manh của các loài trước bàn tay con người.</w:t>
+      </w:r>
+    </w:p>
+    <w:p>
+      <w:pPr>
+        <w:jc w:val="both"/>
+      </w:pPr>
+      <w:r>
+        <w:t>Gợi ý cách kể: cụm hiện vật này rất hợp để lồng thông điệp bảo tồn. Hướng dẫn viên có thể liên hệ với những loài đang nguy cấp mà khách Việt biết (như sao la, tê giác) để câu chuyện tuyệt chủng trở nên gần gũi và đọng lại.</w:t>
+      </w:r>
+    </w:p>
+    <w:p>
+      <w:pPr>
+        <w:pStyle w:val="Heading1"/>
+      </w:pPr>
+      <w:r>
+        <w:rPr>
+          <w:color w:val="152C4E"/>
+        </w:rPr>
+        <w:t>Nadezhda Ladygina-Kots và chú tinh tinh Joni</w:t>
+      </w:r>
+    </w:p>
+    <w:p>
+      <w:pPr>
+        <w:jc w:val="both"/>
+      </w:pPr>
+      <w:r>
+        <w:t>Bên cạnh người chồng làm bảo tàng, Nadezhda Ladygina-Kots (1889–1963) tự mình trở thành một trong những phụ nữ đầu tiên trên thế giới nghiên cứu tâm lý học động vật một cách hệ thống. Năm 1913, hai vợ chồng mua chú tinh tinh nhỏ tên Joni (Giô-ni) và nuôi trong nhà để quan sát — được xem là một trong những trường hợp đầu tiên nuôi vượn trong gia đình người để nghiên cứu bài bản.</w:t>
+      </w:r>
+    </w:p>
+    <w:p>
+      <w:pPr>
+        <w:jc w:val="both"/>
+      </w:pPr>
+      <w:r>
+        <w:t>Bà tiến hành những thí nghiệm nhân văn, tránh gây stress cho con vật: thay vì nhốt, bà giấu phần thưởng sau các chốt đơn giản để Joni tự mở, rồi ghi chép tỉ mỉ cảm xúc, trí nhớ, khả năng dùng công cụ và cả sự đồng cảm của nó — Joni sẽ chạy tới an ủi khi bà giả vờ khóc. Bà cũng được xem là người đặt nền cho phương pháp «chọn mẫu tương ứng» (match-to-sample), trong đó có thí nghiệm bắt Joni nhận diện đồ vật chỉ bằng xúc giác. Joni chết sớm (khoảng 1916) vì viêm phổi.</w:t>
+      </w:r>
+    </w:p>
+    <w:p>
+      <w:pPr>
+        <w:jc w:val="both"/>
+      </w:pPr>
+      <w:r>
+        <w:t>Nhiều năm sau, khi sinh con trai Rudolf (sinh 1925), bà đối chiếu sự phát triển của con mình với những gì đã quan sát ở Joni trước đó, và viết nên công trình kinh điển «Tinh tinh con và trẻ em» (Дитя шимпанзе и дитя человека, 1935). Bản dịch tiếng Anh (2002) có lời tựa của nhà linh trưởng học Frans de Waal, người gọi bà là «nữ anh hùng thầm lặng của khoa học». Lưu ý để tránh kể sai: Joni và cậu con trai KHÔNG hề được nuôi cùng lúc — cậu bé sinh gần một thập niên sau khi Joni chết.</w:t>
+      </w:r>
+    </w:p>
+    <w:p>
+      <w:pPr>
+        <w:jc w:val="both"/>
+      </w:pPr>
+      <w:r>
+        <w:t>Trong bảo tàng có trưng bày tượng bán thân và tư liệu về Joni. Gợi ý cách kể: câu chuyện «chú tinh tinh biết an ủi» rất dễ chạm tới cảm xúc của khách, đồng thời cho thấy khoa học Nga đã đi trước thời đại cả trăm năm trong việc nghiên cứu tình cảm và trí tuệ của loài vật.</w:t>
+      </w:r>
+    </w:p>
+    <w:p>
+      <w:pPr>
+        <w:pStyle w:val="Heading1"/>
+      </w:pPr>
+      <w:r>
+        <w:rPr>
+          <w:color w:val="152C4E"/>
+        </w:rPr>
+        <w:t>Trung tâm tương tác, rạp phim vòm, nhà kính &amp; Paleopark</w:t>
+      </w:r>
+    </w:p>
+    <w:p>
+      <w:pPr>
+        <w:jc w:val="both"/>
+      </w:pPr>
+      <w:r>
+        <w:t>Ngoài toà nhà chính, bảo tàng còn có trung tâm tương tác «Hãy hiểu mình – hiểu thế giới» (Познай себя – познай мир) nằm ở một khối nhà riêng, nối với nhà chính bằng đường hầm dưới đất. Đây là thiên đường của trẻ nhỏ: hàng loạt thiết bị cho khách tự thử cân, đòn bẩy, các giác quan, phản xạ; thậm chí có cả một mặt sàn trong suốt để nhìn xuống thế giới cây cỏ, muông thú «bên dưới». Khu này thường cần vé riêng hoặc vé gộp.</w:t>
+      </w:r>
+    </w:p>
+    <w:p>
+      <w:pPr>
+        <w:jc w:val="both"/>
+      </w:pPr>
+      <w:r>
+        <w:t>Trong khối triển lãm phía sau còn có hành trình «Đi theo con đường tiến hoá» (Пройди путём эволюции) — một lối đi tương tác với hơn 50 mô hình sinh vật cổ đại kích thước thật, cùng trò chơi «phiêu lưu điểu học». Bên cạnh đó là khu côn trùng sống, nhà kính nhiệt đới, và rạp chiếu phim vòm kỹ thuật số với phim 3D về khủng long và bò sát biển.</w:t>
+      </w:r>
+    </w:p>
+    <w:p>
+      <w:pPr>
+        <w:jc w:val="both"/>
+      </w:pPr>
+      <w:r>
+        <w:t>Ra ngoài trời, «công viên cổ sinh» (paleopark, mở năm 2015) trưng bày các mô hình sinh vật tiền sử từng sống trên đất Nga: voi ma-mút, tê giác lông mượt, sư tử hang… kích thước như thật. Đây là điểm chụp ảnh lý tưởng và là phần thưởng cho các bé sau khi đã đi hết các gian trong nhà. Vào mùa hè, khu sân thượng trên nóc khối triển lãm cũng mở để khách ngắm toàn cảnh khu phố.</w:t>
+      </w:r>
+    </w:p>
+    <w:p>
+      <w:pPr>
+        <w:jc w:val="both"/>
+      </w:pPr>
+      <w:r>
+        <w:t>Với đoàn khách Việt, đây là bảo tàng «học mà chơi» đúng nghĩa: nên chừa thời gian cho trẻ tự bấm nút, chơi và khám phá. Trung bình một chuyến tham quan trọn vẹn kéo dài từ hai đến bốn tiếng; bảo tàng có quán cà phê, tủ gửi đồ, nhà vệ sinh sạch và cửa hàng lưu niệm nhiều món quà chủ đề khủng long, động vật rất hợp làm quà cho các bé.</w:t>
       </w:r>
     </w:p>
     <w:p>
@@ -417,7 +710,7 @@
         <w:jc w:val="both"/>
       </w:pPr>
       <w:r>
-        <w:t>Ý nghĩa lớn nhất của Bảo tàng Darwin nằm ở vị thế «đầu tiên» của nó: đây là bảo tàng đầu tiên trên thế giới lấy thuyết tiến hoá làm trục xuyên suốt cho toàn bộ trưng bày. Vào đầu thế kỷ 20, khi ý tưởng của Darwin vẫn còn gây tranh cãi gay gắt ở nhiều nơi, việc một nhà khoa học Nga dựng nên cả một bảo tàng để phổ biến học thuyết này là một hành động vừa can đảm vừa có tầm nhìn xa. Nó đặt Moskva lên bản đồ lịch sử khoa học thế giới theo một cách rất riêng.</w:t>
+        <w:t>Ý nghĩa lớn nhất của Bảo tàng Darwin nằm ở vị thế «đầu tiên» của nó: đây là bảo tàng đầu tiên trên thế giới lấy thuyết tiến hoá làm trục xuyên suốt cho toàn bộ trưng bày. Vào đầu thế kỷ 20, khi ý tưởng của Darwin vẫn còn gây tranh cãi gay gắt ở nhiều nơi, việc một nhà khoa học Nga dựng nên cả một bảo tàng để phổ biến học thuyết này là một hành động vừa can đảm vừa có tầm nhìn xa.</w:t>
       </w:r>
     </w:p>
     <w:p>
@@ -425,7 +718,7 @@
         <w:jc w:val="both"/>
       </w:pPr>
       <w:r>
-        <w:t>Bảo tàng cũng là minh chứng cho một triết lý bảo tàng học mới mẻ mà Kots theo đuổi: khoa học phải được truyền tải như một «trải nghiệm thị giác hấp dẫn», khơi gợi trí tưởng tượng chứ không chỉ chất đầy chữ nghĩa. Ông là tác giả của hơn 200 công trình về bảo tàng học, đến nay vẫn được xem là kinh điển. Ý tưởng kết hợp nghệ thuật — tranh và tượng — với mẫu vật khoa học trong cùng một không gian trưng bày, điều ông nêu ra từ năm 1913, đã trở thành nét đặc trưng của bảo tàng.</w:t>
+        <w:t>Bảo tàng cũng là minh chứng cho một triết lý bảo tàng học mới mẻ mà Kots theo đuổi: khoa học phải được truyền tải như một «trải nghiệm thị giác hấp dẫn», khơi gợi trí tưởng tượng chứ không chỉ chất đầy chữ nghĩa. Ông là tác giả của hơn 200 công trình về bảo tàng học, và ý tưởng kết hợp nghệ thuật — tranh và tượng — với mẫu vật khoa học trong cùng một không gian đã trở thành nét đặc trưng của bảo tàng.</w:t>
       </w:r>
     </w:p>
     <w:p>
@@ -433,7 +726,7 @@
         <w:jc w:val="both"/>
       </w:pPr>
       <w:r>
-        <w:t>Một lớp ý nghĩa văn hoá khác đến từ câu chuyện của người vợ, Nadezhda Ladygina-Kots (Na-đe-giơ-đa La-đư-ghi-na-Cốt). Bà được coi là một trong những phụ nữ đầu tiên trên thế giới nghiên cứu tâm lý học động vật một cách hệ thống, và là người sáng lập Phòng thí nghiệm Tâm lý học của bảo tàng. Công trình của bà đã góp phần đặt nền móng cho ngành tâm lý học so sánh và linh trưởng học hiện đại — một di sản khoa học vượt xa biên giới nước Nga.</w:t>
+        <w:t>Một lớp ý nghĩa văn hoá khác đến từ câu chuyện của Nadezhda Ladygina-Kots — người đặt nền móng cho ngành tâm lý học so sánh và linh trưởng học hiện đại, một di sản khoa học vượt xa biên giới nước Nga. Trong thời kỳ Xô-viết, bảo tàng còn là một «pháo đài thầm lặng» bảo vệ di truyền học trước làn sóng Lysenko.</w:t>
       </w:r>
     </w:p>
     <w:p>
@@ -441,82 +734,7 @@
         <w:jc w:val="both"/>
       </w:pPr>
       <w:r>
-        <w:t>Trong thời kỳ Xô-viết, bảo tàng còn là một «pháo đài thầm lặng» bảo vệ di truyền học trước làn sóng Lysenko. Việc vợ chồng Kots liều mình cất giấu tài liệu khoa học phản ánh một chương bi tráng trong lịch sử khoa học Nga, khi tri thức phải đối mặt với áp lực chính trị. Nhìn ở góc độ đó, mỗi hiện vật và cuốn sách sống sót qua giai đoạn ấy đều mang một giá trị lịch sử kép.</w:t>
-      </w:r>
-    </w:p>
-    <w:p>
-      <w:pPr>
-        <w:jc w:val="both"/>
-      </w:pPr>
-      <w:r>
-        <w:t>Ngày nay, Bảo tàng Darwin còn giữ vai trò là trung tâm phương pháp luận của các bảo tàng khoa học tự nhiên Nga, đứng đầu Hiệp hội các bảo tàng khoa học tự nhiên toàn quốc từ năm 1997. Nó đón hơn nửa triệu lượt khách mỗi năm và từng hai lần đoạt giải Grand Prix của liên hoan «Intermuseum» vào các năm 2007 và 2016. Từ năm 1978, bảo tàng đã được trao Huân chương «Dấu hiệu Danh dự».</w:t>
-      </w:r>
-    </w:p>
-    <w:p>
-      <w:pPr>
-        <w:jc w:val="both"/>
-      </w:pPr>
-      <w:r>
-        <w:t>Với người Nga, đây không chỉ là nơi tham quan mà còn là một địa chỉ giáo dục quen thuộc của bao thế hệ học sinh. Hình ảnh những đứa trẻ say mê trước con voi ma-mút hay bức tranh động vật khổng lồ đã trở thành một phần ký ức tuổi thơ của nhiều gia đình Moskva. Chính sự gắn bó bền chặt ấy làm nên sức sống lâu dài của di sản mà vợ chồng Kots để lại.</w:t>
-      </w:r>
-    </w:p>
-    <w:p>
-      <w:pPr>
-        <w:pStyle w:val="Heading1"/>
-      </w:pPr>
-      <w:r>
-        <w:rPr>
-          <w:color w:val="152C4E"/>
-        </w:rPr>
-        <w:t>Trải nghiệm dành cho du khách</w:t>
-      </w:r>
-    </w:p>
-    <w:p>
-      <w:pPr>
-        <w:jc w:val="both"/>
-      </w:pPr>
-      <w:r>
-        <w:t>Đến với Bảo tàng Darwin, điều đầu tiên du khách cảm nhận được là tinh thần «học mà chơi». Không gian trưng bày được thiết kế để người xem không chỉ đứng nhìn qua lớp kính, mà còn được chạm, bấm nút, lắng nghe và tự khám phá. Đây là kiểu bảo tàng khiến trẻ em thích thú kéo cả cha mẹ vào cuộc tìm hiểu chung.</w:t>
-      </w:r>
-    </w:p>
-    <w:p>
-      <w:pPr>
-        <w:jc w:val="both"/>
-      </w:pPr>
-      <w:r>
-        <w:t>Một trong những trải nghiệm được yêu thích nhất là màn trình diễn «Hành tinh Sống» — sự kết hợp giữa ánh sáng, hình ảnh và âm nhạc kể lại lịch sử sự sống. Bên cạnh đó là trung tâm tương tác «Hãy hiểu mình – hiểu thế giới» (Познай себя – познай мир), khai trương năm 2014, nơi du khách có thể tự kiểm tra các giác quan, phản xạ và khả năng của cơ thể mình qua hàng loạt thiết bị trực quan. Trẻ nhỏ đặc biệt mê khu này.</w:t>
-      </w:r>
-    </w:p>
-    <w:p>
-      <w:pPr>
-        <w:jc w:val="both"/>
-      </w:pPr>
-      <w:r>
-        <w:t>Với những gia đình có con nhỏ, khu côn trùng sống «MiniZoo» và nhà kính là điểm dừng lý tưởng để quan sát sinh vật thật đang chuyển động. Rạp chiếu phim vòm kỹ thuật số cùng các trò chơi mô phỏng 4D và 5D mang lại cảm giác mạnh vui nhộn, biến chuyến tham quan thành một cuộc phiêu lưu. Ngoài ra, bảo tàng thường xuyên tổ chức lớp học chuyên đề, workshop, câu lạc bộ sinh học và cả tiệc sinh nhật cho trẻ.</w:t>
-      </w:r>
-    </w:p>
-    <w:p>
-      <w:pPr>
-        <w:jc w:val="both"/>
-      </w:pPr>
-      <w:r>
-        <w:t>Du khách yêu công nghệ có thể thử tổ hợp tương tác «Du hành cùng muông thú» sử dụng công nghệ thực tế tăng cường (AR), hoặc tham gia các trò chơi truy tìm (quest) có hướng dẫn viên. Bảo tàng cũng phát triển audio guide và những cuốn cẩm nang – sổ tay hướng dẫn dành cho khách ở mọi lứa tuổi, giúp việc tự tham quan trở nên dễ dàng và thú vị hơn.</w:t>
-      </w:r>
-    </w:p>
-    <w:p>
-      <w:pPr>
-        <w:jc w:val="both"/>
-      </w:pPr>
-      <w:r>
-        <w:t>Sau khi mỏi chân, du khách có thể ghé quán cà phê trong bảo tàng để nghỉ ngơi, hoặc lên khu sân thượng để hít thở không khí trong lành. Cửa hàng lưu niệm bán nhiều món quà mang chủ đề khủng long, động vật và tiến hoá — lựa chọn thú vị cho các bạn nhỏ. Không khí trong bảo tàng nhìn chung yên tĩnh và mát mẻ, rất dễ chịu kể cả trong những ngày hè oi bức của Moskva.</w:t>
-      </w:r>
-    </w:p>
-    <w:p>
-      <w:pPr>
-        <w:jc w:val="both"/>
-      </w:pPr>
-      <w:r>
-        <w:t>Một điểm cộng nữa là bảo tàng chú trọng khả năng tiếp cận cho người khuyết tật, với các chương trình và lối đi được thiết kế riêng. Nhờ vậy, đây là điểm đến thân thiện với hầu hết mọi đối tượng khách, từ nhóm gia đình, học sinh cho tới du khách nước ngoài lần đầu ghé thăm. Trung bình, một chuyến tham quan trọn vẹn kéo dài từ hai đến bốn tiếng.</w:t>
+        <w:t>Ngày nay, Bảo tàng Darwin giữ vai trò trung tâm phương pháp luận của các bảo tàng khoa học tự nhiên Nga, đón hơn nửa triệu lượt khách mỗi năm. Với người Nga, đây không chỉ là nơi tham quan mà còn là một địa chỉ giáo dục quen thuộc của bao thế hệ học sinh — hình ảnh những đứa trẻ say mê trước con voi ma-mút đã trở thành một phần ký ức tuổi thơ của nhiều gia đình Moskva.</w:t>
       </w:r>
     </w:p>
     <w:p>
@@ -535,7 +753,7 @@
         <w:jc w:val="both"/>
       </w:pPr>
       <w:r>
-        <w:t>Về giờ mở cửa, bảo tàng đón khách từ 10:00 đến 18:00 tất cả các ngày trong tuần, trừ thứ Hai. Riêng khối triển lãm thường mở muộn hơn vào thứ Năm, từ 13:00 đến 21:00 — rất tiện cho những ai muốn tham quan buổi tối. Du khách nên lưu ý rằng theo một số nguồn, bảo tàng có thể đóng cửa vào thứ Sáu cuối cùng của tháng, nên tốt nhất hãy kiểm tra lịch trên trang chính thức trước khi đi.</w:t>
+        <w:t>Về giờ mở cửa, bảo tàng đón khách từ 10:00 đến 18:00 tất cả các ngày trong tuần, trừ thứ Hai (và đóng cửa ngày 1/1). Riêng khối triển lãm thường mở muộn hơn vào thứ Năm, từ 13:00 đến 21:00 — rất tiện cho những ai muốn tham quan buổi tối. Giờ giấc và ngày nghỉ có thể thay đổi, nên tốt nhất hãy kiểm tra lại trên trang chính thức darwinmuseum.ru trước khi đi.</w:t>
       </w:r>
     </w:p>
     <w:p>
@@ -543,7 +761,7 @@
         <w:jc w:val="both"/>
       </w:pPr>
       <w:r>
-        <w:t>Giá vé ở đây khá phải chăng so với mặt bằng bảo tàng ở châu Âu. Theo dữ liệu tham khảo, vé người lớn vào khoảng 400 rúp, vé ưu đãi cho học sinh, sinh viên và người cao tuổi khoảng 150 rúp, còn trẻ dưới 7 tuổi được miễn phí. Tuy nhiên giá vé và các chương trình có thể thay đổi theo thời gian, vì vậy nên mua vé điện tử qua cổng bán vé chính thức (tickets.mos.ru) hoặc website bảo tàng để có thông tin cập nhật.</w:t>
+        <w:t>Giá vé ở đây khá phải chăng so với mặt bằng bảo tàng châu Âu. Theo dữ liệu tham khảo, vé người lớn cho gian trưng bày chính vào khoảng 400–600 rúp, vé ưu đãi khoảng 200–250 rúp, vé gộp cả trung tâm tương tác khoảng 790 rúp, còn trẻ dưới 7 tuổi được miễn phí. Giá vé có thể thay đổi, nên mua qua cổng bán vé chính thức (tickets.mos.ru) hoặc website bảo tàng để có thông tin cập nhật.</w:t>
       </w:r>
     </w:p>
     <w:p>
@@ -551,7 +769,7 @@
         <w:jc w:val="both"/>
       </w:pPr>
       <w:r>
-        <w:t>Một mẹo tiết kiệm đáng giá: vào Chủ nhật thứ ba hằng tháng, bảo tàng thường mở cửa miễn phí. Nếu lịch trình linh hoạt, du khách có thể canh ngày này để tiết kiệm chi phí. Tuy nhiên, những ngày miễn phí và cuối tuần thường rất đông, đặc biệt là các gia đình có trẻ nhỏ, nên hãy chuẩn bị tinh thần xếp hàng và chen chúc đôi chút.</w:t>
+        <w:t>Để tránh đông, hãy tới bảo tàng ngay khi mở cửa lúc 10:00 vào một ngày trong tuần, hoặc tận dụng khung giờ tối thứ Năm ở khối triển lãm. Nếu đi cùng trẻ em, nên bắt đầu từ các khu tương tác và màn trình diễn «Hành tinh Sống» khi các bé còn nhiều năng lượng, rồi mới đến các gian trưng bày tĩnh; với người lớn quan tâm khoa học, nên dành thời gian cho bộ sưu tập biến dị màu sắc và các loài tuyệt chủng.</w:t>
       </w:r>
     </w:p>
     <w:p>
@@ -559,23 +777,7 @@
         <w:jc w:val="both"/>
       </w:pPr>
       <w:r>
-        <w:t>Để tránh đông, hãy tới bảo tàng ngay khi mở cửa lúc 10:00 vào một ngày trong tuần, hoặc tận dụng khung giờ tối thứ Năm ở khối triển lãm. Nếu đi cùng trẻ em, nên bắt đầu từ các khu tương tác và màn trình diễn «Hành tinh Sống» khi các bé còn nhiều năng lượng, rồi mới đến các gian trưng bày tĩnh. Với người lớn quan tâm khoa học, nên dành thời gian cho bộ sưu tập biến dị màu sắc và các loài tuyệt chủng.</w:t>
-      </w:r>
-    </w:p>
-    <w:p>
-      <w:pPr>
-        <w:jc w:val="both"/>
-      </w:pPr>
-      <w:r>
-        <w:t>Về ngôn ngữ, phần lớn chú thích trong bảo tàng bằng tiếng Nga, chỉ một số khu có thêm tiếng Anh. Du khách không biết tiếng Nga nên tải sẵn ứng dụng dịch có chức năng dịch qua ảnh, hoặc thuê audio guide nếu có bản tiếng Anh. Việc chụp ảnh thường được cho phép, nhưng nên hỏi trước ở những khu trưng bày đặc biệt hoặc triển lãm tạm thời.</w:t>
-      </w:r>
-    </w:p>
-    <w:p>
-      <w:pPr>
-        <w:jc w:val="both"/>
-      </w:pPr>
-      <w:r>
-        <w:t>Cuối cùng, hãy mặc trang phục thoải mái vì bạn sẽ đi bộ và đứng khá nhiều. Bảo tàng có tủ gửi đồ, quán cà phê và nhà vệ sinh sạch sẽ, nên không cần mang theo quá nhiều đồ đạc. Nếu kết hợp tham quan với các điểm lân cận, nên bố trí Bảo tàng Darwin vào buổi sáng để còn thời gian dạo chơi công viên vào buổi chiều.</w:t>
+        <w:t>Về ngôn ngữ, phần lớn chú thích trong bảo tàng bằng tiếng Nga, chỉ một số khu có thêm tiếng Anh. Du khách nên tải sẵn ứng dụng dịch qua ảnh, hoặc thuê audio guide nếu có bản tiếng Anh. Việc chụp ảnh thường được cho phép (không dùng đèn flash và chân máy), nhưng nên hỏi trước ở các triển lãm tạm thời. Nên mặc trang phục thoải mái vì sẽ đi bộ và đứng khá nhiều.</w:t>
       </w:r>
     </w:p>
     <w:p>
@@ -594,7 +796,7 @@
         <w:jc w:val="both"/>
       </w:pPr>
       <w:r>
-        <w:t>Bảo tàng Darwin nằm trong quận Akademichesky — khu phố mang đậm chất trí thức của Moskva, nơi tập trung hàng loạt viện nghiên cứu thuộc Viện Hàn lâm Khoa học Nga. Dạo bộ quanh đây, du khách sẽ cảm nhận được một nhịp sống khác của thủ đô: yên tĩnh, nhiều cây xanh, xen kẽ những toà nhà căn hộ kiểu Xô-viết và các trung tâm khoa học. Đây là dịp tốt để nhìn Moskva ở góc độ đời thường thay vì chỉ qua các điểm du lịch nổi tiếng.</w:t>
+        <w:t>Bảo tàng Darwin nằm trong quận Akademichesky — khu phố mang đậm chất trí thức của Moskva, nơi tập trung hàng loạt viện nghiên cứu thuộc Viện Hàn lâm Khoa học Nga. Dạo bộ quanh đây, du khách cảm nhận được một nhịp sống khác của thủ đô: yên tĩnh, nhiều cây xanh, xen kẽ những toà nhà căn hộ kiểu Xô-viết và các trung tâm khoa học.</w:t>
       </w:r>
     </w:p>
     <w:p>
@@ -602,7 +804,7 @@
         <w:jc w:val="both"/>
       </w:pPr>
       <w:r>
-        <w:t>Nhờ nằm ngay trên «tuyến cam» (Kaluzhsko–Rizhskaya) của metro, việc kết nối tới các điểm khác rất thuận tiện. Chỉ vài ga về phía bắc là khu vực Quảng trường Gagarin (Ploshchad Gagarina) trên đại lộ Leninsky, nơi có tượng đài Yuri Gagarin (I-u-ri Ga-ga-rin) bằng titan cao vút — biểu tượng cho kỷ nguyên chinh phục vũ trụ của Liên Xô. Đây là điểm dừng thú vị cho những ai mê lịch sử không gian.</w:t>
+        <w:t>Nhờ nằm ngay trên «tuyến cam» của metro, việc kết nối tới các điểm khác rất thuận tiện. Chỉ vài ga về phía bắc là khu vực Quảng trường Gagarin trên đại lộ Leninsky, nơi có tượng đài Yuri Gagarin bằng titan cao vút — biểu tượng cho kỷ nguyên chinh phục vũ trụ của Liên Xô, một điểm dừng thú vị cho những ai mê lịch sử không gian.</w:t>
       </w:r>
     </w:p>
     <w:p>
@@ -610,7 +812,7 @@
         <w:jc w:val="both"/>
       </w:pPr>
       <w:r>
-        <w:t>Về phía đông bắc, dọc theo đại lộ Leninsky và bờ sông Moskva, du khách có thể tìm đến Vườn Neskuchny (Nhe-xcus-nưi) và Công viên Gorky (Goóc-ki) — quần thể công viên và vườn cảnh lớn, lãng mạn bậc nhất Moskva. Đây chính là không gian thiên nhiên lý tưởng để thư giãn sau khi rời bảo tàng, với những lối đi ven sông, rừng cây cổ thụ và các khoảng xanh rộng rãi.</w:t>
+        <w:t>Về phía đông bắc, dọc bờ sông Moskva, du khách có thể tìm đến Vườn Neskuchny và Công viên Gorky — quần thể công viên lãng mạn bậc nhất Moskva, không gian lý tưởng để thư giãn sau khi rời bảo tàng. Nếu bắt tàu điện số 14 hoặc 39 về hướng ga Universitet, du khách sẽ tới gần khu Đồi Chim Sẻ (Vorobyovy Gory) và toà nhà chính đồ sộ của Đại học Tổng hợp Moskva, nơi có đài quan sát ngắm toàn cảnh thành phố.</w:t>
       </w:r>
     </w:p>
     <w:p>
@@ -618,23 +820,7 @@
         <w:jc w:val="both"/>
       </w:pPr>
       <w:r>
-        <w:t>Nếu bắt tàu điện số 14 hoặc 39 về hướng ga Universitet, du khách sẽ tới gần khu Đồi Chim Sẻ (Vorobyovy Gory, Vô-rô-bi-ô-vư Gô-rư) — khu bảo tồn thiên nhiên nổi tiếng bên bờ cao sông Moskva, và toà nhà chính đồ sộ của Đại học Tổng hợp Moskva. Đài quan sát trên Đồi Chim Sẻ cho tầm nhìn toàn cảnh thành phố tuyệt đẹp, đặc biệt vào lúc hoàng hôn.</w:t>
-      </w:r>
-    </w:p>
-    <w:p>
-      <w:pPr>
-        <w:jc w:val="both"/>
-      </w:pPr>
-      <w:r>
-        <w:t>Với những ai vẫn còn hứng thú với chủ đề khoa học tự nhiên, có thể tiếp tục hành trình tới Bảo tàng Cổ sinh vật học Yuri Orlov nằm ở phía nam thành phố, trên phố Profsoyuznaya. Đây là một trong những bảo tàng cổ sinh lớn nhất thế giới, với vô số bộ xương khủng long và hoá thạch — một sự nối tiếp hoàn hảo cho câu chuyện tiến hoá mà Bảo tàng Darwin đã khởi đầu.</w:t>
-      </w:r>
-    </w:p>
-    <w:p>
-      <w:pPr>
-        <w:jc w:val="both"/>
-      </w:pPr>
-      <w:r>
-        <w:t>Khu vực này cũng không thiếu các quán ăn, quán cà phê và trung tâm thương mại phục vụ nhu cầu nghỉ ngơi, ăn uống. Du khách có thể dễ dàng kết hợp một buổi sáng ở Bảo tàng Darwin với một buổi chiều dạo công viên hoặc ngắm cảnh trên Đồi Chim Sẻ, tạo thành một ngày trọn vẹn khám phá phía tây nam Moskva — vùng đất của khoa học, cây xanh và những khoảng lặng.</w:t>
+        <w:t>Với những ai vẫn còn hứng thú với khoa học tự nhiên, có thể tiếp tục tới Bảo tàng Cổ sinh vật học Yuri Orlov ở phía nam thành phố, trên phố Profsoyuznaya — một trong những bảo tàng cổ sinh lớn nhất thế giới, với vô số bộ xương khủng long và hoá thạch, một sự nối tiếp hoàn hảo cho câu chuyện tiến hoá mà Bảo tàng Darwin đã khởi đầu.</w:t>
       </w:r>
     </w:p>
     <w:p>
@@ -653,7 +839,7 @@
         <w:jc w:val="both"/>
       </w:pPr>
       <w:r>
-        <w:t>Giai thoại nổi tiếng nhất về người sáng lập Aleksandr Kots kể rằng, ngay từ thời niên thiếu, cậu bé Kots đã tự nguyện nhịn ăn sáng để dành tiền mua những con chim chết và tranh ảnh động vật cho bộ sưu tập của mình. Chính ông về sau viết rằng «sự bền bỉ» ấy đã theo ông suốt nửa thế kỷ, thôi thúc ông ngày qua ngày gom góp hàng nghìn hiện vật khoa học cho bảo tàng. Câu chuyện nhỏ này hé lộ nguồn gốc của một đam mê phi thường đứng sau cả một thiết chế lớn.</w:t>
+        <w:t>Giai thoại nổi tiếng nhất kể rằng ngay từ thời niên thiếu, cậu bé Kots đã tự nguyện nhịn ăn sáng để dành tiền mua những con chim chết và tranh ảnh động vật cho bộ sưu tập của mình. Chính «sự bền bỉ» ấy đã theo ông suốt nửa thế kỷ, thôi thúc ông ngày qua ngày gom góp hàng nghìn hiện vật — và tất cả khởi đầu từ con thỏ đen 15 rúp mua ở chợ năm 1907.</w:t>
       </w:r>
     </w:p>
     <w:p>
@@ -661,7 +847,7 @@
         <w:jc w:val="both"/>
       </w:pPr>
       <w:r>
-        <w:t>Một giai thoại cảm động khác thuộc về đôi vợ chồng Kots. Trong những năm đầu gian khó, họ thường lấy chính khoản tiền lẽ ra để mua thức ăn mà mua thú và chim quý về cho bảo tàng. Suốt nửa thế kỷ, người vợ Nadezhda đã sát cánh cùng chồng trong cuộc «chiến đấu» không ngơi nghỉ để tìm nguồn lực nuôi sống bộ sưu tập. Ở đây, tình yêu khoa học và tình yêu đôi lứa hoà làm một.</w:t>
+        <w:t>Câu chuyện «con voi ướp muối» luôn khiến khách trầm trồ: con voi châu Phi của Nga hoàng chết trên đường về, bộ da nằm trong thùng muối gần chục năm, rồi được Filipp Fedulov nhồi năm 1927 với ngà gỗ và «cơ bắp» bằng rơm. Kots nói gọn: «Không có Fedulov thì không có bảo tàng».</w:t>
       </w:r>
     </w:p>
     <w:p>
@@ -669,7 +855,7 @@
         <w:jc w:val="both"/>
       </w:pPr>
       <w:r>
-        <w:t>Câu chuyện khoa học ly kỳ nhất gắn với chú tinh tinh tên Joni (Giô-ni). Năm 1913, Nadezhda mua Joni từ những người buôn thú ở Moskva và nuôi dạy nó như một đứa trẻ, ghi chép tỉ mỉ từng biểu cảm, cử chỉ và cảm xúc. Hơn mười năm sau, khi sinh con trai Rudolf (Ru-đôn-phơ), bà so sánh song song sự phát triển của con mình với những gì đã quan sát được ở Joni.</w:t>
+        <w:t>Một giai thoại cảm động thời chiến là chuyện con chó Igor — một con chó Newfoundland từng ra mặt trận, cõng thương binh và bị một viên đạn găm vào đầu không thể lấy ra; nó vẫn sống tiếp cùng viên đạn ấy, và nhiều năm sau người chủ cũ tìm lại được. Một giai thoại khác kể rằng con gấu Himalaya nửa bạch tạng (mặt và chân trắng) từng được đưa tới triển lãm nông nghiệp năm 1923 rồi về bảo tàng năm 1924.</w:t>
       </w:r>
     </w:p>
     <w:p>
@@ -677,7 +863,7 @@
         <w:jc w:val="both"/>
       </w:pPr>
       <w:r>
-        <w:t>Kết quả của công trình độc đáo ấy là cuốn sách kinh điển «Tinh tinh con và trẻ em» (1935), đối chiếu từng điểm về cảm xúc và trí tuệ giữa hai loài. Nadezhda còn được xem là người phát minh ra phương pháp «chọn mẫu tương ứng» (match-to-sample), trong đó có cả những thí nghiệm bắt Joni nhận diện đồ vật chỉ bằng xúc giác trong một chiếc túi kín. Nhiều thập niên sau, các nhà khoa học vẫn coi những thí nghiệm này là đi trước thời đại.</w:t>
+        <w:t>Ngay bộ sừng hươu 28 nhánh trong bảo tàng cũng có chuyện: nó đến từ một cuộc đi săn năm 1903 của Nga hoàng Nikolai II cùng tướng Kochubey — ban đầu Nga hoàng nhận là chiến lợi phẩm của mình, sau mới nhường lại cho vị tướng có phát súng hạ con thú. Những mẩu chuyện như thế biến từng hiện vật thành một nhân vật có số phận.</w:t>
       </w:r>
     </w:p>
     <w:p>
@@ -685,15 +871,7 @@
         <w:jc w:val="both"/>
       </w:pPr>
       <w:r>
-        <w:t>Danh tiếng của bà vượt ra ngoài biên giới Liên Xô. Nhà tâm lý học Mỹ Robert Yerkes (Rô-bớt Iơ-két) từng sang tận Moskva năm 1929 để trao đổi về công trình so sánh tinh tinh và trẻ em, còn Nadezhda cho đúc một bức tượng bán thân của ông đặt trong bảo tàng. Đến năm 1960, một nhà tâm lý học Mỹ lừng danh khác là Harry Harlow (Ha-ri Ha-lâu) đã viết thư bày tỏ sự ngưỡng mộ và thừa nhận rằng giới khoa học «nợ» bà một món nợ lớn.</w:t>
-      </w:r>
-    </w:p>
-    <w:p>
-      <w:pPr>
-        <w:jc w:val="both"/>
-      </w:pPr>
-      <w:r>
-        <w:t>Cuối cùng, không thể không nhắc tới giai thoại pho tượng Lamarck đặt ở lối vào như một tấm «bình phong» khôn ngoan trong thời Lysenko, cùng những tài liệu di truyền học được giấu kín giữa đống thú nhồi nơi tầng hầm. Chi tiết ấy khiến người ta hình dung bảo tàng không chỉ là nơi trưng bày quá khứ, mà từng là một chiến tuyến thầm lặng bảo vệ chân lý khoa học. Chính những câu chuyện như thế đã thổi hồn vào từng hiện vật, biến Bảo tàng Darwin thành một nơi vừa để học, vừa để rung cảm.</w:t>
+        <w:t>Cuối cùng, không thể không nhắc pho tượng Lamarck đặt ở lối vào như một tấm «bình phong» khôn ngoan thời Lysenko, cùng những tài liệu di truyền học được giấu kín giữa đống thú nhồi nơi tầng hầm. Chi tiết ấy khiến người ta hình dung bảo tàng từng là một chiến tuyến thầm lặng bảo vệ chân lý khoa học — một nơi vừa để học, vừa để rung cảm.</w:t>
       </w:r>
     </w:p>
     <w:p>
@@ -813,14 +991,14 @@
         <w:rPr>
           <w:sz w:val="22"/>
         </w:rPr>
-        <w:t xml:space="preserve">• Aleksandr Kots — Wikipedia (tiếng Anh) — </w:t>
+        <w:t xml:space="preserve">• Государственный Дарвиновский музей — Wikipedia (tiếng Nga) — </w:t>
       </w:r>
       <w:r>
         <w:rPr>
           <w:color w:val="204A86"/>
           <w:sz w:val="20"/>
         </w:rPr>
-        <w:t>https://en.wikipedia.org/wiki/Aleksandr_Kots</w:t>
+        <w:t>https://ru.wikipedia.org/wiki/Государственный_Дарвиновский_музей</w:t>
       </w:r>
     </w:p>
     <w:p>
@@ -843,14 +1021,14 @@
         <w:rPr>
           <w:sz w:val="22"/>
         </w:rPr>
-        <w:t xml:space="preserve">• Государственный Дарвиновский музей — Wikipedia (tiếng Nga) — </w:t>
+        <w:t xml:space="preserve">• Trang chính thức Bảo tàng Darwin — About Museum (EN) — </w:t>
       </w:r>
       <w:r>
         <w:rPr>
           <w:color w:val="204A86"/>
           <w:sz w:val="20"/>
         </w:rPr>
-        <w:t>https://ru.wikipedia.org/wiki/Государственный_Дарвиновский_музей</w:t>
+        <w:t>https://www.darwinmuseum.ru/section/english-back/about-museum</w:t>
       </w:r>
     </w:p>
     <w:p>
@@ -858,14 +1036,14 @@
         <w:rPr>
           <w:sz w:val="22"/>
         </w:rPr>
-        <w:t xml:space="preserve">• Trang chính thức Bảo tàng Darwin — About Us / Lịch sử — </w:t>
+        <w:t xml:space="preserve">• Trang chính thức — Lịch sử các bộ sưu tập — </w:t>
       </w:r>
       <w:r>
         <w:rPr>
           <w:color w:val="204A86"/>
           <w:sz w:val="20"/>
         </w:rPr>
-        <w:t>https://www.darwinmuseum.ru/section/english-version/about-us</w:t>
+        <w:t>https://www.darwinmuseum.ru/pages/istoriya-kollekcij</w:t>
       </w:r>
     </w:p>
     <w:p>
@@ -873,14 +1051,14 @@
         <w:rPr>
           <w:sz w:val="22"/>
         </w:rPr>
-        <w:t xml:space="preserve">• Trang chính thức Bảo tàng Darwin — General Information (thông tin tham quan) — </w:t>
+        <w:t xml:space="preserve">• Trang chính thức — Nghệ nhân nhồi thú gia đình Fedulov — </w:t>
       </w:r>
       <w:r>
         <w:rPr>
           <w:color w:val="204A86"/>
           <w:sz w:val="20"/>
         </w:rPr>
-        <w:t>https://www.darwinmuseum.ru/pages/general-information?eng=</w:t>
+        <w:t>https://www.darwinmuseum.ru/projects/exhibition/lyudi-muzeya-taksidermisty-fedulovy</w:t>
       </w:r>
     </w:p>
     <w:p>
@@ -888,7 +1066,22 @@
         <w:rPr>
           <w:sz w:val="22"/>
         </w:rPr>
-        <w:t xml:space="preserve">• One in 10,000: The Darwin Museum's exhibit of unusual animals — mos.ru — </w:t>
+        <w:t xml:space="preserve">• Rossiyskaya Gazeta — Kho hiện vật đóng kín của Bảo tàng Darwin (2017) — </w:t>
+      </w:r>
+      <w:r>
+        <w:rPr>
+          <w:color w:val="204A86"/>
+          <w:sz w:val="20"/>
+        </w:rPr>
+        <w:t>https://rg.ru/2017/03/27/chto-skryvaetsia-v-zakrytyh-hranilishchah-darvinovskogo-muzeia.html</w:t>
+      </w:r>
+    </w:p>
+    <w:p>
+      <w:r>
+        <w:rPr>
+          <w:sz w:val="22"/>
+        </w:rPr>
+        <w:t xml:space="preserve">• mos.ru — «One in 10,000»: triển lãm động vật khác thường — </w:t>
       </w:r>
       <w:r>
         <w:rPr>
@@ -903,14 +1096,29 @@
         <w:rPr>
           <w:sz w:val="22"/>
         </w:rPr>
-        <w:t xml:space="preserve">• Meet Nadezhda Ladygina-Kohts: The first woman to study animal psychology — mos.ru — </w:t>
+        <w:t xml:space="preserve">• Vokrug Sveta — «Nữ anh hùng thầm lặng của khoa học» (Ladygina-Kots) — </w:t>
       </w:r>
       <w:r>
         <w:rPr>
           <w:color w:val="204A86"/>
           <w:sz w:val="20"/>
         </w:rPr>
-        <w:t>https://www.mos.ru/en/news/item/74118073/</w:t>
+        <w:t>https://www.vokrugsveta.ru/articles/nevospetaya-geroinya-nauki-kak-muza-mayakovskogo-uchila-zhivotnykh-logike-a-lyudei-sostradaniyu-id850420/</w:t>
+      </w:r>
+    </w:p>
+    <w:p>
+      <w:r>
+        <w:rPr>
+          <w:sz w:val="22"/>
+        </w:rPr>
+        <w:t xml:space="preserve">• Afisha Daily — «Ba câu chuyện về chim dodo» — </w:t>
+      </w:r>
+      <w:r>
+        <w:rPr>
+          <w:color w:val="204A86"/>
+          <w:sz w:val="20"/>
+        </w:rPr>
+        <w:t>https://daily.afisha.ru/culture/7430-tri-istorii-dodo-pochemu-stoit-uvidet-novuyu-vystavku-v-darvinovskom-muzee/</w:t>
       </w:r>
     </w:p>
     <w:p>
@@ -930,7 +1138,7 @@
           <w:color w:val="5C6773"/>
           <w:sz w:val="20"/>
         </w:rPr>
-        <w:t>Wikipedia tiếng Anh (mục «State Darwin Museum») — thành lập năm 1907, bảo tàng tiến hoá đầu tiên trên thế giới, khoảng 400.000 hiện vật, toạ độ 55,69° B / 37,56° Đ.</w:t>
+        <w:t>Wikipedia tiếng Anh &amp; tiếng Nga (State Darwin Museum / Государственный Дарвиновский музей) — thành lập 1907, bảo tàng tiến hoá đầu tiên thế giới, ~400.000 hiện vật, 3 tầng, hơn 500.000 khách/năm.</w:t>
       </w:r>
     </w:p>
     <w:p>
@@ -939,7 +1147,7 @@
           <w:color w:val="5C6773"/>
           <w:sz w:val="20"/>
         </w:rPr>
-        <w:t>Wikipedia tiếng Anh (mục «Aleksandr Kots») — tiểu sử người sáng lập: sinh năm 1880, học nhồi thú và giành huy chương vàng, thám hiểm Tây Siberia, kết hôn với Nadezhda Ladygina năm 1911, con trai Rudolf, làm giám đốc tới năm 1964.</w:t>
+        <w:t>Trang chính thức darwinmuseum.ru — About Museum (danh sách gian trưng bày theo tầng, quy mô 3 toà nhà &gt;20.000 m²) và trang «Lịch sử các bộ sưu tập» (con thỏ đen ký hiệu số 1 mua 28/2/1907 giá 15 rúp; bộ sưu tập Khomyakov 1919 gồm dodo, anca lớn, bồ câu viễn khách; thầy Lorentz).</w:t>
       </w:r>
     </w:p>
     <w:p>
@@ -948,7 +1156,7 @@
           <w:color w:val="5C6773"/>
           <w:sz w:val="20"/>
         </w:rPr>
-        <w:t>Wikipedia tiếng Anh (mục «Nadezhda Ladygina-Kohts») — nghiên cứu tinh tinh Joni, sách «Infant Chimpanzee and Human Child» (1935), phương pháp match-to-sample, thư từ với Robert Yerkes và Harry Harlow, việc giấu tài liệu di truyền và đặt tượng Lamarck thời Lysenko.</w:t>
+        <w:t>Trang chính thức darwinmuseum.ru — «Nghệ nhân nhồi thú gia đình Fedulov»: Filipp Fedulov (1881–1962) làm voi châu Phi 1927 và voi châu Á 1936; Dmitry Fedulov (1896–1985) làm 200+ chim ruồi; hai người tạo hơn 4.500 tiêu bản; câu «Không có Fedulov thì không có bảo tàng».</w:t>
       </w:r>
     </w:p>
     <w:p>
@@ -957,7 +1165,7 @@
           <w:color w:val="5C6773"/>
           <w:sz w:val="20"/>
         </w:rPr>
-        <w:t>Wikipedia tiếng Nga (mục «Государственный Дарвиновский музей») — lịch sử xây dựng toà nhà (KTS Bartoshevich, viện Mosproekt-3, giếng trời kính hình tam giác), khối triển lãm 1996–2007, bộ sưu tập aberrant, chim dodo / anca / bồ câu viễn khách, tranh của Vatagin – Komarov, sách Aldrovandi, paleopark ngoài trời, show «Живая планета».</w:t>
+        <w:t>mos.ru &amp; Rossiyskaya Gazeta — triển lãm «One in 10,000» (~800 con hiếm, 34 cá thể bạch tạng thuần); kho tiêu bản, mối đe doạ từ nhậy; con voi ướp muối và câu chuyện Anna Akhmatova; con chó Igor mang đạn; sừng hươu 28 nhánh của Nikolai II.</w:t>
       </w:r>
     </w:p>
     <w:p>
@@ -966,7 +1174,7 @@
           <w:color w:val="5C6773"/>
           <w:sz w:val="20"/>
         </w:rPr>
-        <w:t>Trang chính thức darwinmuseum.ru (mục About Us và Lịch sử) — chi tiết tiểu sử Kots, mở cửa toà nhà mới năm 1995, show ánh sáng – âm nhạc «The Living Planet», giám đốc Anna Klyukina từ năm 1988.</w:t>
+        <w:t>Wikipedia (Nadezhda Ladygina-Kohts) &amp; Vokrug Sveta — chú tinh tinh Joni (mua 1913, mất ~1916 vì viêm phổi), sách «Tinh tinh con và trẻ em» (1935; bản Anh 2002 có lời tựa Frans de Waal), phương pháp match-to-sample; đính chính rằng Joni và con trai Rudolf (sinh 1925) KHÔNG được nuôi cùng lúc.</w:t>
       </w:r>
     </w:p>
     <w:p>
@@ -975,7 +1183,7 @@
           <w:color w:val="5C6773"/>
           <w:sz w:val="20"/>
         </w:rPr>
-        <w:t>Trang chính thức darwinmuseum.ru và cổng tickets.mos.ru (thông tin tham quan) — địa chỉ phố Vavilova 57, giờ mở cửa 10:00–18:00 (trừ thứ Hai), khối triển lãm thứ Năm 13:00–21:00, đường đi từ metro Akademicheskaya, bãi đỗ 45 xe.</w:t>
+        <w:t>Afisha Daily &amp; darwinmuseum.ru — bộ xương dodo (bộ gần hoàn chỉnh duy nhất ở Nga) lắp tại Deyrolle (Paris) rồi về Moskva qua nhà bảo trợ Khomyakov; chi tiết dodo trong «Alice ở xứ sở thần tiên» của Lewis Carroll.</w:t>
       </w:r>
     </w:p>
     <w:p>
@@ -984,16 +1192,7 @@
           <w:color w:val="5C6773"/>
           <w:sz w:val="20"/>
         </w:rPr>
-        <w:t>Cổng thông tin mos.ru — triển lãm «One in 10,000» về động vật khác thường (khoảng 800 con hiếm, 34 cá thể bạch tạng thuần; thỏ Mãn Châu, hươu xạ Siberia, desman) và tiểu sử Nadezhda Ladygina-Kots.</w:t>
-      </w:r>
-    </w:p>
-    <w:p>
-      <w:r>
-        <w:rPr>
-          <w:color w:val="5C6773"/>
-          <w:sz w:val="20"/>
-        </w:rPr>
-        <w:t>Tổng hợp kết quả WebSearch (Rusmania, The Moscow Times, expresstorussia, findit.city...) — giá vé tham khảo (~400 / 150 rúp, miễn phí Chủ nhật thứ ba hằng tháng), hơn 500.000 khách/năm, giải Grand Prix «Intermuseum» năm 2007 và 2016.</w:t>
+        <w:t>Tổng hợp WebSearch (travelbelka.ru, kp.ru, putevka.com, strana.ru) — bố cục theo tầng, show «Hành tinh Sống», hành trình «Đi theo con đường tiến hoá», trung tâm tương tác «Hãy hiểu mình – hiểu thế giới», paleopark 2015; giá vé và giờ mở cửa tham khảo (10:00–18:00, nghỉ thứ Hai; khối triển lãm thứ Năm 13:00–21:00). Một số nguồn nêu khả năng nghỉ thứ Sáu cuối tháng — cần kiểm chứng lại vì trang chính thức chỉ ghi nghỉ thứ Hai và 1/1.</w:t>
       </w:r>
     </w:p>
     <w:p>
@@ -1003,7 +1202,7 @@
           <w:color w:val="5C6773"/>
           <w:sz w:val="18"/>
         </w:rPr>
-        <w:t>Tài liệu nội bộ — không dùng cho mục đích public. Biên soạn nguyên gốc, có dẫn nguồn. Cập nhật 2026-08-11.</w:t>
+        <w:t>Tài liệu nội bộ — không dùng cho mục đích public. Biên soạn nguyên gốc, có dẫn nguồn. Cập nhật 2026-09-28.</w:t>
       </w:r>
     </w:p>
     <w:sectPr>

</xml_diff>